<commit_message>
chore: bo theo doi ban dung trung — goi nop 49,9 -> 38 MB
Kiem bam sha256 toan bo goi: 11,9 MB la ban trung y het nhau. Ba san pham
dung nam o CA HAI cho:
  docs/papers/mon-hoc/thesis-full.pdf   = nop/01-do-an-mon-hoc.pdf    5,3 MB
  docs/slides/12-slides-mon-hoc.pptx    = nop/02-slide-mon-hoc.pptx   4,4 MB
  docs/papers/mon-hoc/thesis-full.docx  = nop/01-do-an-mon-hoc.docx   1,5 MB
kem thesis-full.md — ban ghep tu sinh tu 8 tep chuong, khong ai doc.

Gio chi theo doi ban trong nop/. Cac tep tren van duoc build_thesis.py va
export_thesis_pdf.ps1 sinh ra binh thuong, chi khong nam trong git nua —
giu hai ban con tao rui ro that: chung tung lech nhau (bay PAGEREF=0 da xay
ra ba lan vi ban nay de len ban kia).

Kem: bo theo doi .claude/ — cau hinh cong cu phat trien, khong thuoc bai nop.

Kiem: dung lai + xuat lai day du sau khi go — PDF 40 trang, nop 3 tep,
refs 0 chet.
</commit_message>
<xml_diff>
--- a/nop/01-do-an-mon-hoc.docx
+++ b/nop/01-do-an-mon-hoc.docx
@@ -148,7 +148,7 @@
         <w:pStyle w:val="Heading1"/>
       </w:pPr>
       <w:bookmarkStart w:id="0" w:name="đồ-án-môn-học"/>
-      <w:bookmarkStart w:id="1" w:name="_Toc239341170"/>
+      <w:bookmarkStart w:id="1" w:name="_Toc239341908"/>
       <w:r>
         <w:t>Đ</w:t>
       </w:r>
@@ -220,7 +220,7 @@
         <w:pStyle w:val="Heading1"/>
       </w:pPr>
       <w:bookmarkStart w:id="4" w:name="Xbe958ce37c6a089ac9bdc99dada4ec5e2c0f7da"/>
-      <w:bookmarkStart w:id="5" w:name="_Toc239341171"/>
+      <w:bookmarkStart w:id="5" w:name="_Toc239341909"/>
       <w:bookmarkEnd w:id="0"/>
       <w:bookmarkEnd w:id="3"/>
       <w:r>
@@ -795,7 +795,7 @@
     </w:p>
     <w:p>
       <w:r>
-        <w:pict w14:anchorId="59183089">
+        <w:pict w14:anchorId="0450AF3E">
           <v:rect id="_x0000_i1025" style="width:0;height:1.5pt" o:hralign="center" o:hrstd="t" o:hr="t"/>
         </w:pict>
       </w:r>
@@ -805,7 +805,7 @@
         <w:pStyle w:val="Heading2"/>
       </w:pPr>
       <w:bookmarkStart w:id="6" w:name="mục-lục"/>
-      <w:bookmarkStart w:id="7" w:name="_Toc239341172"/>
+      <w:bookmarkStart w:id="7" w:name="_Toc239341910"/>
       <w:r>
         <w:t>M</w:t>
       </w:r>
@@ -845,7 +845,7 @@
       <w:r>
         <w:fldChar w:fldCharType="separate"/>
       </w:r>
-      <w:hyperlink w:anchor="_Toc239341170" w:history="1">
+      <w:hyperlink w:anchor="_Toc239341908" w:history="1">
         <w:r>
           <w:rPr>
             <w:rStyle w:val="Hyperlink"/>
@@ -872,7 +872,7 @@
             <w:noProof/>
             <w:webHidden/>
           </w:rPr>
-          <w:instrText xml:space="preserve"> PAGEREF _Toc239341170 \h </w:instrText>
+          <w:instrText xml:space="preserve"> PAGEREF _Toc239341908 \h </w:instrText>
         </w:r>
         <w:r>
           <w:rPr>
@@ -916,7 +916,7 @@
           <w14:ligatures w14:val="standardContextual"/>
         </w:rPr>
       </w:pPr>
-      <w:hyperlink w:anchor="_Toc239341171" w:history="1">
+      <w:hyperlink w:anchor="_Toc239341909" w:history="1">
         <w:r>
           <w:rPr>
             <w:rStyle w:val="Hyperlink"/>
@@ -943,7 +943,7 @@
             <w:noProof/>
             <w:webHidden/>
           </w:rPr>
-          <w:instrText xml:space="preserve"> PAGEREF _Toc239341171 \h </w:instrText>
+          <w:instrText xml:space="preserve"> PAGEREF _Toc239341909 \h </w:instrText>
         </w:r>
         <w:r>
           <w:rPr>
@@ -987,7 +987,7 @@
           <w14:ligatures w14:val="standardContextual"/>
         </w:rPr>
       </w:pPr>
-      <w:hyperlink w:anchor="_Toc239341172" w:history="1">
+      <w:hyperlink w:anchor="_Toc239341910" w:history="1">
         <w:r>
           <w:rPr>
             <w:rStyle w:val="Hyperlink"/>
@@ -1014,7 +1014,7 @@
             <w:noProof/>
             <w:webHidden/>
           </w:rPr>
-          <w:instrText xml:space="preserve"> PAGEREF _Toc239341172 \h </w:instrText>
+          <w:instrText xml:space="preserve"> PAGEREF _Toc239341910 \h </w:instrText>
         </w:r>
         <w:r>
           <w:rPr>
@@ -1058,7 +1058,7 @@
           <w14:ligatures w14:val="standardContextual"/>
         </w:rPr>
       </w:pPr>
-      <w:hyperlink w:anchor="_Toc239341173" w:history="1">
+      <w:hyperlink w:anchor="_Toc239341911" w:history="1">
         <w:r>
           <w:rPr>
             <w:rStyle w:val="Hyperlink"/>
@@ -1085,7 +1085,7 @@
             <w:noProof/>
             <w:webHidden/>
           </w:rPr>
-          <w:instrText xml:space="preserve"> PAGEREF _Toc239341173 \h </w:instrText>
+          <w:instrText xml:space="preserve"> PAGEREF _Toc239341911 \h </w:instrText>
         </w:r>
         <w:r>
           <w:rPr>
@@ -1129,7 +1129,7 @@
           <w14:ligatures w14:val="standardContextual"/>
         </w:rPr>
       </w:pPr>
-      <w:hyperlink w:anchor="_Toc239341174" w:history="1">
+      <w:hyperlink w:anchor="_Toc239341912" w:history="1">
         <w:r>
           <w:rPr>
             <w:rStyle w:val="Hyperlink"/>
@@ -1156,7 +1156,7 @@
             <w:noProof/>
             <w:webHidden/>
           </w:rPr>
-          <w:instrText xml:space="preserve"> PAGEREF _Toc239341174 \h </w:instrText>
+          <w:instrText xml:space="preserve"> PAGEREF _Toc239341912 \h </w:instrText>
         </w:r>
         <w:r>
           <w:rPr>
@@ -1200,7 +1200,7 @@
           <w14:ligatures w14:val="standardContextual"/>
         </w:rPr>
       </w:pPr>
-      <w:hyperlink w:anchor="_Toc239341175" w:history="1">
+      <w:hyperlink w:anchor="_Toc239341913" w:history="1">
         <w:r>
           <w:rPr>
             <w:rStyle w:val="Hyperlink"/>
@@ -1227,7 +1227,7 @@
             <w:noProof/>
             <w:webHidden/>
           </w:rPr>
-          <w:instrText xml:space="preserve"> PAGEREF _Toc239341175 \h </w:instrText>
+          <w:instrText xml:space="preserve"> PAGEREF _Toc239341913 \h </w:instrText>
         </w:r>
         <w:r>
           <w:rPr>
@@ -1271,7 +1271,7 @@
           <w14:ligatures w14:val="standardContextual"/>
         </w:rPr>
       </w:pPr>
-      <w:hyperlink w:anchor="_Toc239341176" w:history="1">
+      <w:hyperlink w:anchor="_Toc239341914" w:history="1">
         <w:r>
           <w:rPr>
             <w:rStyle w:val="Hyperlink"/>
@@ -1298,7 +1298,7 @@
             <w:noProof/>
             <w:webHidden/>
           </w:rPr>
-          <w:instrText xml:space="preserve"> PAGEREF _Toc239341176 \h </w:instrText>
+          <w:instrText xml:space="preserve"> PAGEREF _Toc239341914 \h </w:instrText>
         </w:r>
         <w:r>
           <w:rPr>
@@ -1342,7 +1342,7 @@
           <w14:ligatures w14:val="standardContextual"/>
         </w:rPr>
       </w:pPr>
-      <w:hyperlink w:anchor="_Toc239341177" w:history="1">
+      <w:hyperlink w:anchor="_Toc239341915" w:history="1">
         <w:r>
           <w:rPr>
             <w:rStyle w:val="Hyperlink"/>
@@ -1369,7 +1369,7 @@
             <w:noProof/>
             <w:webHidden/>
           </w:rPr>
-          <w:instrText xml:space="preserve"> PAGEREF _Toc239341177 \h </w:instrText>
+          <w:instrText xml:space="preserve"> PAGEREF _Toc239341915 \h </w:instrText>
         </w:r>
         <w:r>
           <w:rPr>
@@ -1413,7 +1413,7 @@
           <w14:ligatures w14:val="standardContextual"/>
         </w:rPr>
       </w:pPr>
-      <w:hyperlink w:anchor="_Toc239341178" w:history="1">
+      <w:hyperlink w:anchor="_Toc239341916" w:history="1">
         <w:r>
           <w:rPr>
             <w:rStyle w:val="Hyperlink"/>
@@ -1440,7 +1440,7 @@
             <w:noProof/>
             <w:webHidden/>
           </w:rPr>
-          <w:instrText xml:space="preserve"> PAGEREF _Toc239341178 \h </w:instrText>
+          <w:instrText xml:space="preserve"> PAGEREF _Toc239341916 \h </w:instrText>
         </w:r>
         <w:r>
           <w:rPr>
@@ -1484,7 +1484,7 @@
           <w14:ligatures w14:val="standardContextual"/>
         </w:rPr>
       </w:pPr>
-      <w:hyperlink w:anchor="_Toc239341179" w:history="1">
+      <w:hyperlink w:anchor="_Toc239341917" w:history="1">
         <w:r>
           <w:rPr>
             <w:rStyle w:val="Hyperlink"/>
@@ -1511,7 +1511,7 @@
             <w:noProof/>
             <w:webHidden/>
           </w:rPr>
-          <w:instrText xml:space="preserve"> PAGEREF _Toc239341179 \h </w:instrText>
+          <w:instrText xml:space="preserve"> PAGEREF _Toc239341917 \h </w:instrText>
         </w:r>
         <w:r>
           <w:rPr>
@@ -1555,7 +1555,7 @@
           <w14:ligatures w14:val="standardContextual"/>
         </w:rPr>
       </w:pPr>
-      <w:hyperlink w:anchor="_Toc239341180" w:history="1">
+      <w:hyperlink w:anchor="_Toc239341918" w:history="1">
         <w:r>
           <w:rPr>
             <w:rStyle w:val="Hyperlink"/>
@@ -1582,7 +1582,7 @@
             <w:noProof/>
             <w:webHidden/>
           </w:rPr>
-          <w:instrText xml:space="preserve"> PAGEREF _Toc239341180 \h </w:instrText>
+          <w:instrText xml:space="preserve"> PAGEREF _Toc239341918 \h </w:instrText>
         </w:r>
         <w:r>
           <w:rPr>
@@ -1626,7 +1626,7 @@
           <w14:ligatures w14:val="standardContextual"/>
         </w:rPr>
       </w:pPr>
-      <w:hyperlink w:anchor="_Toc239341181" w:history="1">
+      <w:hyperlink w:anchor="_Toc239341919" w:history="1">
         <w:r>
           <w:rPr>
             <w:rStyle w:val="Hyperlink"/>
@@ -1653,7 +1653,7 @@
             <w:noProof/>
             <w:webHidden/>
           </w:rPr>
-          <w:instrText xml:space="preserve"> PAGEREF _Toc239341181 \h </w:instrText>
+          <w:instrText xml:space="preserve"> PAGEREF _Toc239341919 \h </w:instrText>
         </w:r>
         <w:r>
           <w:rPr>
@@ -1697,7 +1697,7 @@
           <w14:ligatures w14:val="standardContextual"/>
         </w:rPr>
       </w:pPr>
-      <w:hyperlink w:anchor="_Toc239341182" w:history="1">
+      <w:hyperlink w:anchor="_Toc239341920" w:history="1">
         <w:r>
           <w:rPr>
             <w:rStyle w:val="Hyperlink"/>
@@ -1724,7 +1724,7 @@
             <w:noProof/>
             <w:webHidden/>
           </w:rPr>
-          <w:instrText xml:space="preserve"> PAGEREF _Toc239341182 \h </w:instrText>
+          <w:instrText xml:space="preserve"> PAGEREF _Toc239341920 \h </w:instrText>
         </w:r>
         <w:r>
           <w:rPr>
@@ -1768,7 +1768,7 @@
           <w14:ligatures w14:val="standardContextual"/>
         </w:rPr>
       </w:pPr>
-      <w:hyperlink w:anchor="_Toc239341183" w:history="1">
+      <w:hyperlink w:anchor="_Toc239341921" w:history="1">
         <w:r>
           <w:rPr>
             <w:rStyle w:val="Hyperlink"/>
@@ -1795,7 +1795,7 @@
             <w:noProof/>
             <w:webHidden/>
           </w:rPr>
-          <w:instrText xml:space="preserve"> PAGEREF _Toc239341183 \h </w:instrText>
+          <w:instrText xml:space="preserve"> PAGEREF _Toc239341921 \h </w:instrText>
         </w:r>
         <w:r>
           <w:rPr>
@@ -1839,7 +1839,7 @@
           <w14:ligatures w14:val="standardContextual"/>
         </w:rPr>
       </w:pPr>
-      <w:hyperlink w:anchor="_Toc239341184" w:history="1">
+      <w:hyperlink w:anchor="_Toc239341922" w:history="1">
         <w:r>
           <w:rPr>
             <w:rStyle w:val="Hyperlink"/>
@@ -1866,7 +1866,7 @@
             <w:noProof/>
             <w:webHidden/>
           </w:rPr>
-          <w:instrText xml:space="preserve"> PAGEREF _Toc239341184 \h </w:instrText>
+          <w:instrText xml:space="preserve"> PAGEREF _Toc239341922 \h </w:instrText>
         </w:r>
         <w:r>
           <w:rPr>
@@ -1910,7 +1910,7 @@
           <w14:ligatures w14:val="standardContextual"/>
         </w:rPr>
       </w:pPr>
-      <w:hyperlink w:anchor="_Toc239341185" w:history="1">
+      <w:hyperlink w:anchor="_Toc239341923" w:history="1">
         <w:r>
           <w:rPr>
             <w:rStyle w:val="Hyperlink"/>
@@ -1937,7 +1937,7 @@
             <w:noProof/>
             <w:webHidden/>
           </w:rPr>
-          <w:instrText xml:space="preserve"> PAGEREF _Toc239341185 \h </w:instrText>
+          <w:instrText xml:space="preserve"> PAGEREF _Toc239341923 \h </w:instrText>
         </w:r>
         <w:r>
           <w:rPr>
@@ -1981,7 +1981,7 @@
           <w14:ligatures w14:val="standardContextual"/>
         </w:rPr>
       </w:pPr>
-      <w:hyperlink w:anchor="_Toc239341186" w:history="1">
+      <w:hyperlink w:anchor="_Toc239341924" w:history="1">
         <w:r>
           <w:rPr>
             <w:rStyle w:val="Hyperlink"/>
@@ -2008,7 +2008,7 @@
             <w:noProof/>
             <w:webHidden/>
           </w:rPr>
-          <w:instrText xml:space="preserve"> PAGEREF _Toc239341186 \h </w:instrText>
+          <w:instrText xml:space="preserve"> PAGEREF _Toc239341924 \h </w:instrText>
         </w:r>
         <w:r>
           <w:rPr>
@@ -2052,7 +2052,7 @@
           <w14:ligatures w14:val="standardContextual"/>
         </w:rPr>
       </w:pPr>
-      <w:hyperlink w:anchor="_Toc239341187" w:history="1">
+      <w:hyperlink w:anchor="_Toc239341925" w:history="1">
         <w:r>
           <w:rPr>
             <w:rStyle w:val="Hyperlink"/>
@@ -2079,7 +2079,7 @@
             <w:noProof/>
             <w:webHidden/>
           </w:rPr>
-          <w:instrText xml:space="preserve"> PAGEREF _Toc239341187 \h </w:instrText>
+          <w:instrText xml:space="preserve"> PAGEREF _Toc239341925 \h </w:instrText>
         </w:r>
         <w:r>
           <w:rPr>
@@ -2123,7 +2123,7 @@
           <w14:ligatures w14:val="standardContextual"/>
         </w:rPr>
       </w:pPr>
-      <w:hyperlink w:anchor="_Toc239341188" w:history="1">
+      <w:hyperlink w:anchor="_Toc239341926" w:history="1">
         <w:r>
           <w:rPr>
             <w:rStyle w:val="Hyperlink"/>
@@ -2150,7 +2150,7 @@
             <w:noProof/>
             <w:webHidden/>
           </w:rPr>
-          <w:instrText xml:space="preserve"> PAGEREF _Toc239341188 \h </w:instrText>
+          <w:instrText xml:space="preserve"> PAGEREF _Toc239341926 \h </w:instrText>
         </w:r>
         <w:r>
           <w:rPr>
@@ -2194,7 +2194,7 @@
           <w14:ligatures w14:val="standardContextual"/>
         </w:rPr>
       </w:pPr>
-      <w:hyperlink w:anchor="_Toc239341189" w:history="1">
+      <w:hyperlink w:anchor="_Toc239341927" w:history="1">
         <w:r>
           <w:rPr>
             <w:rStyle w:val="Hyperlink"/>
@@ -2221,7 +2221,7 @@
             <w:noProof/>
             <w:webHidden/>
           </w:rPr>
-          <w:instrText xml:space="preserve"> PAGEREF _Toc239341189 \h </w:instrText>
+          <w:instrText xml:space="preserve"> PAGEREF _Toc239341927 \h </w:instrText>
         </w:r>
         <w:r>
           <w:rPr>
@@ -2265,7 +2265,7 @@
           <w14:ligatures w14:val="standardContextual"/>
         </w:rPr>
       </w:pPr>
-      <w:hyperlink w:anchor="_Toc239341190" w:history="1">
+      <w:hyperlink w:anchor="_Toc239341928" w:history="1">
         <w:r>
           <w:rPr>
             <w:rStyle w:val="Hyperlink"/>
@@ -2292,7 +2292,7 @@
             <w:noProof/>
             <w:webHidden/>
           </w:rPr>
-          <w:instrText xml:space="preserve"> PAGEREF _Toc239341190 \h </w:instrText>
+          <w:instrText xml:space="preserve"> PAGEREF _Toc239341928 \h </w:instrText>
         </w:r>
         <w:r>
           <w:rPr>
@@ -2336,7 +2336,7 @@
           <w14:ligatures w14:val="standardContextual"/>
         </w:rPr>
       </w:pPr>
-      <w:hyperlink w:anchor="_Toc239341191" w:history="1">
+      <w:hyperlink w:anchor="_Toc239341929" w:history="1">
         <w:r>
           <w:rPr>
             <w:rStyle w:val="Hyperlink"/>
@@ -2363,7 +2363,7 @@
             <w:noProof/>
             <w:webHidden/>
           </w:rPr>
-          <w:instrText xml:space="preserve"> PAGEREF _Toc239341191 \h </w:instrText>
+          <w:instrText xml:space="preserve"> PAGEREF _Toc239341929 \h </w:instrText>
         </w:r>
         <w:r>
           <w:rPr>
@@ -2407,7 +2407,7 @@
           <w14:ligatures w14:val="standardContextual"/>
         </w:rPr>
       </w:pPr>
-      <w:hyperlink w:anchor="_Toc239341192" w:history="1">
+      <w:hyperlink w:anchor="_Toc239341930" w:history="1">
         <w:r>
           <w:rPr>
             <w:rStyle w:val="Hyperlink"/>
@@ -2434,7 +2434,7 @@
             <w:noProof/>
             <w:webHidden/>
           </w:rPr>
-          <w:instrText xml:space="preserve"> PAGEREF _Toc239341192 \h </w:instrText>
+          <w:instrText xml:space="preserve"> PAGEREF _Toc239341930 \h </w:instrText>
         </w:r>
         <w:r>
           <w:rPr>
@@ -2478,7 +2478,7 @@
           <w14:ligatures w14:val="standardContextual"/>
         </w:rPr>
       </w:pPr>
-      <w:hyperlink w:anchor="_Toc239341193" w:history="1">
+      <w:hyperlink w:anchor="_Toc239341931" w:history="1">
         <w:r>
           <w:rPr>
             <w:rStyle w:val="Hyperlink"/>
@@ -2505,7 +2505,7 @@
             <w:noProof/>
             <w:webHidden/>
           </w:rPr>
-          <w:instrText xml:space="preserve"> PAGEREF _Toc239341193 \h </w:instrText>
+          <w:instrText xml:space="preserve"> PAGEREF _Toc239341931 \h </w:instrText>
         </w:r>
         <w:r>
           <w:rPr>
@@ -2549,7 +2549,7 @@
           <w14:ligatures w14:val="standardContextual"/>
         </w:rPr>
       </w:pPr>
-      <w:hyperlink w:anchor="_Toc239341194" w:history="1">
+      <w:hyperlink w:anchor="_Toc239341932" w:history="1">
         <w:r>
           <w:rPr>
             <w:rStyle w:val="Hyperlink"/>
@@ -2576,7 +2576,7 @@
             <w:noProof/>
             <w:webHidden/>
           </w:rPr>
-          <w:instrText xml:space="preserve"> PAGEREF _Toc239341194 \h </w:instrText>
+          <w:instrText xml:space="preserve"> PAGEREF _Toc239341932 \h </w:instrText>
         </w:r>
         <w:r>
           <w:rPr>
@@ -2620,7 +2620,7 @@
           <w14:ligatures w14:val="standardContextual"/>
         </w:rPr>
       </w:pPr>
-      <w:hyperlink w:anchor="_Toc239341195" w:history="1">
+      <w:hyperlink w:anchor="_Toc239341933" w:history="1">
         <w:r>
           <w:rPr>
             <w:rStyle w:val="Hyperlink"/>
@@ -2647,7 +2647,7 @@
             <w:noProof/>
             <w:webHidden/>
           </w:rPr>
-          <w:instrText xml:space="preserve"> PAGEREF _Toc239341195 \h </w:instrText>
+          <w:instrText xml:space="preserve"> PAGEREF _Toc239341933 \h </w:instrText>
         </w:r>
         <w:r>
           <w:rPr>
@@ -2691,7 +2691,7 @@
           <w14:ligatures w14:val="standardContextual"/>
         </w:rPr>
       </w:pPr>
-      <w:hyperlink w:anchor="_Toc239341196" w:history="1">
+      <w:hyperlink w:anchor="_Toc239341934" w:history="1">
         <w:r>
           <w:rPr>
             <w:rStyle w:val="Hyperlink"/>
@@ -2718,7 +2718,7 @@
             <w:noProof/>
             <w:webHidden/>
           </w:rPr>
-          <w:instrText xml:space="preserve"> PAGEREF _Toc239341196 \h </w:instrText>
+          <w:instrText xml:space="preserve"> PAGEREF _Toc239341934 \h </w:instrText>
         </w:r>
         <w:r>
           <w:rPr>
@@ -2762,7 +2762,7 @@
           <w14:ligatures w14:val="standardContextual"/>
         </w:rPr>
       </w:pPr>
-      <w:hyperlink w:anchor="_Toc239341197" w:history="1">
+      <w:hyperlink w:anchor="_Toc239341935" w:history="1">
         <w:r>
           <w:rPr>
             <w:rStyle w:val="Hyperlink"/>
@@ -2789,7 +2789,7 @@
             <w:noProof/>
             <w:webHidden/>
           </w:rPr>
-          <w:instrText xml:space="preserve"> PAGEREF _Toc239341197 \h </w:instrText>
+          <w:instrText xml:space="preserve"> PAGEREF _Toc239341935 \h </w:instrText>
         </w:r>
         <w:r>
           <w:rPr>
@@ -2833,7 +2833,7 @@
           <w14:ligatures w14:val="standardContextual"/>
         </w:rPr>
       </w:pPr>
-      <w:hyperlink w:anchor="_Toc239341198" w:history="1">
+      <w:hyperlink w:anchor="_Toc239341936" w:history="1">
         <w:r>
           <w:rPr>
             <w:rStyle w:val="Hyperlink"/>
@@ -2860,7 +2860,7 @@
             <w:noProof/>
             <w:webHidden/>
           </w:rPr>
-          <w:instrText xml:space="preserve"> PAGEREF _Toc239341198 \h </w:instrText>
+          <w:instrText xml:space="preserve"> PAGEREF _Toc239341936 \h </w:instrText>
         </w:r>
         <w:r>
           <w:rPr>
@@ -2904,7 +2904,7 @@
           <w14:ligatures w14:val="standardContextual"/>
         </w:rPr>
       </w:pPr>
-      <w:hyperlink w:anchor="_Toc239341199" w:history="1">
+      <w:hyperlink w:anchor="_Toc239341937" w:history="1">
         <w:r>
           <w:rPr>
             <w:rStyle w:val="Hyperlink"/>
@@ -2931,7 +2931,7 @@
             <w:noProof/>
             <w:webHidden/>
           </w:rPr>
-          <w:instrText xml:space="preserve"> PAGEREF _Toc239341199 \h </w:instrText>
+          <w:instrText xml:space="preserve"> PAGEREF _Toc239341937 \h </w:instrText>
         </w:r>
         <w:r>
           <w:rPr>
@@ -2975,7 +2975,7 @@
           <w14:ligatures w14:val="standardContextual"/>
         </w:rPr>
       </w:pPr>
-      <w:hyperlink w:anchor="_Toc239341200" w:history="1">
+      <w:hyperlink w:anchor="_Toc239341938" w:history="1">
         <w:r>
           <w:rPr>
             <w:rStyle w:val="Hyperlink"/>
@@ -3002,7 +3002,7 @@
             <w:noProof/>
             <w:webHidden/>
           </w:rPr>
-          <w:instrText xml:space="preserve"> PAGEREF _Toc239341200 \h </w:instrText>
+          <w:instrText xml:space="preserve"> PAGEREF _Toc239341938 \h </w:instrText>
         </w:r>
         <w:r>
           <w:rPr>
@@ -3046,7 +3046,7 @@
           <w14:ligatures w14:val="standardContextual"/>
         </w:rPr>
       </w:pPr>
-      <w:hyperlink w:anchor="_Toc239341201" w:history="1">
+      <w:hyperlink w:anchor="_Toc239341939" w:history="1">
         <w:r>
           <w:rPr>
             <w:rStyle w:val="Hyperlink"/>
@@ -3073,7 +3073,7 @@
             <w:noProof/>
             <w:webHidden/>
           </w:rPr>
-          <w:instrText xml:space="preserve"> PAGEREF _Toc239341201 \h </w:instrText>
+          <w:instrText xml:space="preserve"> PAGEREF _Toc239341939 \h </w:instrText>
         </w:r>
         <w:r>
           <w:rPr>
@@ -3117,7 +3117,7 @@
           <w14:ligatures w14:val="standardContextual"/>
         </w:rPr>
       </w:pPr>
-      <w:hyperlink w:anchor="_Toc239341202" w:history="1">
+      <w:hyperlink w:anchor="_Toc239341940" w:history="1">
         <w:r>
           <w:rPr>
             <w:rStyle w:val="Hyperlink"/>
@@ -3144,7 +3144,7 @@
             <w:noProof/>
             <w:webHidden/>
           </w:rPr>
-          <w:instrText xml:space="preserve"> PAGEREF _Toc239341202 \h </w:instrText>
+          <w:instrText xml:space="preserve"> PAGEREF _Toc239341940 \h </w:instrText>
         </w:r>
         <w:r>
           <w:rPr>
@@ -3188,7 +3188,7 @@
           <w14:ligatures w14:val="standardContextual"/>
         </w:rPr>
       </w:pPr>
-      <w:hyperlink w:anchor="_Toc239341203" w:history="1">
+      <w:hyperlink w:anchor="_Toc239341941" w:history="1">
         <w:r>
           <w:rPr>
             <w:rStyle w:val="Hyperlink"/>
@@ -3215,7 +3215,7 @@
             <w:noProof/>
             <w:webHidden/>
           </w:rPr>
-          <w:instrText xml:space="preserve"> PAGEREF _Toc239341203 \h </w:instrText>
+          <w:instrText xml:space="preserve"> PAGEREF _Toc239341941 \h </w:instrText>
         </w:r>
         <w:r>
           <w:rPr>
@@ -3259,7 +3259,7 @@
           <w14:ligatures w14:val="standardContextual"/>
         </w:rPr>
       </w:pPr>
-      <w:hyperlink w:anchor="_Toc239341204" w:history="1">
+      <w:hyperlink w:anchor="_Toc239341942" w:history="1">
         <w:r>
           <w:rPr>
             <w:rStyle w:val="Hyperlink"/>
@@ -3286,7 +3286,7 @@
             <w:noProof/>
             <w:webHidden/>
           </w:rPr>
-          <w:instrText xml:space="preserve"> PAGEREF _Toc239341204 \h </w:instrText>
+          <w:instrText xml:space="preserve"> PAGEREF _Toc239341942 \h </w:instrText>
         </w:r>
         <w:r>
           <w:rPr>
@@ -3330,7 +3330,7 @@
           <w14:ligatures w14:val="standardContextual"/>
         </w:rPr>
       </w:pPr>
-      <w:hyperlink w:anchor="_Toc239341205" w:history="1">
+      <w:hyperlink w:anchor="_Toc239341943" w:history="1">
         <w:r>
           <w:rPr>
             <w:rStyle w:val="Hyperlink"/>
@@ -3357,7 +3357,7 @@
             <w:noProof/>
             <w:webHidden/>
           </w:rPr>
-          <w:instrText xml:space="preserve"> PAGEREF _Toc239341205 \h </w:instrText>
+          <w:instrText xml:space="preserve"> PAGEREF _Toc239341943 \h </w:instrText>
         </w:r>
         <w:r>
           <w:rPr>
@@ -3401,7 +3401,7 @@
           <w14:ligatures w14:val="standardContextual"/>
         </w:rPr>
       </w:pPr>
-      <w:hyperlink w:anchor="_Toc239341206" w:history="1">
+      <w:hyperlink w:anchor="_Toc239341944" w:history="1">
         <w:r>
           <w:rPr>
             <w:rStyle w:val="Hyperlink"/>
@@ -3428,7 +3428,7 @@
             <w:noProof/>
             <w:webHidden/>
           </w:rPr>
-          <w:instrText xml:space="preserve"> PAGEREF _Toc239341206 \h </w:instrText>
+          <w:instrText xml:space="preserve"> PAGEREF _Toc239341944 \h </w:instrText>
         </w:r>
         <w:r>
           <w:rPr>
@@ -3472,7 +3472,7 @@
           <w14:ligatures w14:val="standardContextual"/>
         </w:rPr>
       </w:pPr>
-      <w:hyperlink w:anchor="_Toc239341207" w:history="1">
+      <w:hyperlink w:anchor="_Toc239341945" w:history="1">
         <w:r>
           <w:rPr>
             <w:rStyle w:val="Hyperlink"/>
@@ -3499,7 +3499,7 @@
             <w:noProof/>
             <w:webHidden/>
           </w:rPr>
-          <w:instrText xml:space="preserve"> PAGEREF _Toc239341207 \h </w:instrText>
+          <w:instrText xml:space="preserve"> PAGEREF _Toc239341945 \h </w:instrText>
         </w:r>
         <w:r>
           <w:rPr>
@@ -3545,7 +3545,7 @@
         <w:pStyle w:val="Heading1"/>
       </w:pPr>
       <w:bookmarkStart w:id="8" w:name="chương-1-giới-thiệu"/>
-      <w:bookmarkStart w:id="9" w:name="_Toc239341173"/>
+      <w:bookmarkStart w:id="9" w:name="_Toc239341911"/>
       <w:bookmarkEnd w:id="4"/>
       <w:bookmarkEnd w:id="6"/>
       <w:r>
@@ -3570,7 +3570,7 @@
         <w:pStyle w:val="Heading2"/>
       </w:pPr>
       <w:bookmarkStart w:id="10" w:name="X7d99df2d9d0c5141050eb9941026463f4c8ea2b"/>
-      <w:bookmarkStart w:id="11" w:name="_Toc239341174"/>
+      <w:bookmarkStart w:id="11" w:name="_Toc239341912"/>
       <w:r>
         <w:t>1.1. Đ</w:t>
       </w:r>
@@ -5420,7 +5420,7 @@
         <w:pStyle w:val="Heading2"/>
       </w:pPr>
       <w:bookmarkStart w:id="12" w:name="X60021b7b958505251ec70bd32e2bac9f8a0361c"/>
-      <w:bookmarkStart w:id="13" w:name="_Toc239341175"/>
+      <w:bookmarkStart w:id="13" w:name="_Toc239341913"/>
       <w:bookmarkEnd w:id="10"/>
       <w:r>
         <w:t>1.2. M</w:t>
@@ -7366,7 +7366,7 @@
         <w:pStyle w:val="Heading2"/>
       </w:pPr>
       <w:bookmarkStart w:id="17" w:name="X03724c88a1b7da9b434cf0a8db5356690a4bb71"/>
-      <w:bookmarkStart w:id="18" w:name="_Toc239341176"/>
+      <w:bookmarkStart w:id="18" w:name="_Toc239341914"/>
       <w:bookmarkEnd w:id="12"/>
       <w:bookmarkEnd w:id="16"/>
       <w:r>
@@ -9171,7 +9171,7 @@
         <w:pStyle w:val="Heading1"/>
       </w:pPr>
       <w:bookmarkStart w:id="20" w:name="chương-2-cơ-sở-lý-thuyết"/>
-      <w:bookmarkStart w:id="21" w:name="_Toc239341177"/>
+      <w:bookmarkStart w:id="21" w:name="_Toc239341915"/>
       <w:bookmarkEnd w:id="8"/>
       <w:bookmarkEnd w:id="17"/>
       <w:r>
@@ -9468,7 +9468,7 @@
         <w:pStyle w:val="Heading2"/>
       </w:pPr>
       <w:bookmarkStart w:id="22" w:name="X2256001523e16d112c59df938522f140b8b988e"/>
-      <w:bookmarkStart w:id="23" w:name="_Toc239341178"/>
+      <w:bookmarkStart w:id="23" w:name="_Toc239341916"/>
       <w:r>
         <w:t>2.1. Quy chu</w:t>
       </w:r>
@@ -14147,7 +14147,7 @@
         <w:pStyle w:val="Heading2"/>
       </w:pPr>
       <w:bookmarkStart w:id="30" w:name="Xb21b4f0690a73e92e2a35192cb39315a0956521"/>
-      <w:bookmarkStart w:id="31" w:name="_Toc239341179"/>
+      <w:bookmarkStart w:id="31" w:name="_Toc239341917"/>
       <w:bookmarkEnd w:id="22"/>
       <w:bookmarkEnd w:id="28"/>
       <w:r>
@@ -19387,7 +19387,7 @@
         <w:pStyle w:val="Heading2"/>
       </w:pPr>
       <w:bookmarkStart w:id="38" w:name="X8ff52f1334e3f0e382caf7ffa1b7096a981291c"/>
-      <w:bookmarkStart w:id="39" w:name="_Toc239341180"/>
+      <w:bookmarkStart w:id="39" w:name="_Toc239341918"/>
       <w:bookmarkEnd w:id="30"/>
       <w:bookmarkEnd w:id="37"/>
       <w:r>
@@ -19666,7 +19666,7 @@
           <w:noProof/>
         </w:rPr>
         <w:drawing>
-          <wp:inline distT="0" distB="0" distL="0" distR="0" wp14:anchorId="100AD908" wp14:editId="0B34B28B">
+          <wp:inline distT="0" distB="0" distL="0" distR="0" wp14:anchorId="265FA2FC" wp14:editId="3DFC5FA2">
             <wp:extent cx="5334000" cy="1435553"/>
             <wp:effectExtent l="0" t="0" r="0" b="0"/>
             <wp:docPr id="37" name="Picture"/>
@@ -21128,7 +21128,7 @@
         <w:pStyle w:val="Heading2"/>
       </w:pPr>
       <w:bookmarkStart w:id="43" w:name="X1a77f36e16d4ad267b00eabe7cf793e1dbe08e9"/>
-      <w:bookmarkStart w:id="44" w:name="_Toc239341181"/>
+      <w:bookmarkStart w:id="44" w:name="_Toc239341919"/>
       <w:bookmarkEnd w:id="38"/>
       <w:bookmarkEnd w:id="42"/>
       <w:r>
@@ -22298,7 +22298,7 @@
           <w:noProof/>
         </w:rPr>
         <w:drawing>
-          <wp:inline distT="0" distB="0" distL="0" distR="0" wp14:anchorId="7FB23F88" wp14:editId="743C37B8">
+          <wp:inline distT="0" distB="0" distL="0" distR="0" wp14:anchorId="15EDABA3" wp14:editId="59DE4143">
             <wp:extent cx="5334000" cy="2884362"/>
             <wp:effectExtent l="0" t="0" r="0" b="0"/>
             <wp:docPr id="44" name="Picture"/>
@@ -22564,7 +22564,7 @@
           <w:noProof/>
         </w:rPr>
         <w:drawing>
-          <wp:inline distT="0" distB="0" distL="0" distR="0" wp14:anchorId="45327CAA" wp14:editId="3CE5521C">
+          <wp:inline distT="0" distB="0" distL="0" distR="0" wp14:anchorId="3E7A9842" wp14:editId="002FEB8E">
             <wp:extent cx="5334000" cy="632732"/>
             <wp:effectExtent l="0" t="0" r="0" b="0"/>
             <wp:docPr id="49" name="Picture"/>
@@ -24467,7 +24467,7 @@
         <w:pStyle w:val="Heading1"/>
       </w:pPr>
       <w:bookmarkStart w:id="50" w:name="chương-3-thiết-kế-và-cài-đặt"/>
-      <w:bookmarkStart w:id="51" w:name="_Toc239341182"/>
+      <w:bookmarkStart w:id="51" w:name="_Toc239341920"/>
       <w:bookmarkEnd w:id="20"/>
       <w:bookmarkEnd w:id="43"/>
       <w:bookmarkEnd w:id="49"/>
@@ -24499,7 +24499,7 @@
         <w:pStyle w:val="Heading2"/>
       </w:pPr>
       <w:bookmarkStart w:id="52" w:name="X21a22cc9b66dca004f2960f37df13c53a04e97b"/>
-      <w:bookmarkStart w:id="53" w:name="_Toc239341183"/>
+      <w:bookmarkStart w:id="53" w:name="_Toc239341921"/>
       <w:r>
         <w:t>3.1. Ki</w:t>
       </w:r>
@@ -24591,7 +24591,7 @@
           <w:noProof/>
         </w:rPr>
         <w:drawing>
-          <wp:inline distT="0" distB="0" distL="0" distR="0" wp14:anchorId="448BD988" wp14:editId="44251CAF">
+          <wp:inline distT="0" distB="0" distL="0" distR="0" wp14:anchorId="496C5651" wp14:editId="5C382FF3">
             <wp:extent cx="5334000" cy="401410"/>
             <wp:effectExtent l="0" t="0" r="0" b="0"/>
             <wp:docPr id="57" name="Picture"/>
@@ -26260,7 +26260,7 @@
         <w:pStyle w:val="Heading2"/>
       </w:pPr>
       <w:bookmarkStart w:id="55" w:name="X1f307d8f8c73bce8db8683c986faea6c8ea66a3"/>
-      <w:bookmarkStart w:id="56" w:name="_Toc239341184"/>
+      <w:bookmarkStart w:id="56" w:name="_Toc239341922"/>
       <w:bookmarkEnd w:id="52"/>
       <w:r>
         <w:t>3.2. Xây d</w:t>
@@ -26327,7 +26327,7 @@
           <w:noProof/>
         </w:rPr>
         <w:drawing>
-          <wp:inline distT="0" distB="0" distL="0" distR="0" wp14:anchorId="5ECA3D17" wp14:editId="0F967B31">
+          <wp:inline distT="0" distB="0" distL="0" distR="0" wp14:anchorId="72947349" wp14:editId="4417BAF2">
             <wp:extent cx="5334000" cy="802821"/>
             <wp:effectExtent l="0" t="0" r="0" b="0"/>
             <wp:docPr id="62" name="Picture"/>
@@ -30439,7 +30439,7 @@
         <w:pStyle w:val="Heading2"/>
       </w:pPr>
       <w:bookmarkStart w:id="62" w:name="X6a397cb1739f1ec0a8c9714808f79a5ce1fbf6f"/>
-      <w:bookmarkStart w:id="63" w:name="_Toc239341185"/>
+      <w:bookmarkStart w:id="63" w:name="_Toc239341923"/>
       <w:bookmarkEnd w:id="55"/>
       <w:bookmarkEnd w:id="61"/>
       <w:r>
@@ -32005,7 +32005,7 @@
         <w:pStyle w:val="Heading2"/>
       </w:pPr>
       <w:bookmarkStart w:id="65" w:name="X9c2c9b365086d10c999a46e4942f14d73b6baa5"/>
-      <w:bookmarkStart w:id="66" w:name="_Toc239341186"/>
+      <w:bookmarkStart w:id="66" w:name="_Toc239341924"/>
       <w:bookmarkEnd w:id="62"/>
       <w:r>
         <w:t>3.4. Kh</w:t>
@@ -32789,7 +32789,7 @@
           <w:noProof/>
         </w:rPr>
         <w:drawing>
-          <wp:inline distT="0" distB="0" distL="0" distR="0" wp14:anchorId="1B00C67E" wp14:editId="07CB9263">
+          <wp:inline distT="0" distB="0" distL="0" distR="0" wp14:anchorId="5D6BA077" wp14:editId="04F7EB2C">
             <wp:extent cx="5334000" cy="8969712"/>
             <wp:effectExtent l="0" t="0" r="0" b="0"/>
             <wp:docPr id="73" name="Picture"/>
@@ -38738,7 +38738,7 @@
         <w:pStyle w:val="Heading2"/>
       </w:pPr>
       <w:bookmarkStart w:id="75" w:name="Xb17945b5d9374e5087c2c96ace1685ff00e2e22"/>
-      <w:bookmarkStart w:id="76" w:name="_Toc239341187"/>
+      <w:bookmarkStart w:id="76" w:name="_Toc239341925"/>
       <w:bookmarkEnd w:id="65"/>
       <w:bookmarkEnd w:id="74"/>
       <w:r>
@@ -40108,7 +40108,7 @@
         <w:pStyle w:val="Heading2"/>
       </w:pPr>
       <w:bookmarkStart w:id="77" w:name="Xfad7df3f963ac0b8ebfe8cf87d7c64fa075f760"/>
-      <w:bookmarkStart w:id="78" w:name="_Toc239341188"/>
+      <w:bookmarkStart w:id="78" w:name="_Toc239341926"/>
       <w:bookmarkEnd w:id="75"/>
       <w:r>
         <w:t>3.6. B</w:t>
@@ -40154,7 +40154,7 @@
           <w:noProof/>
         </w:rPr>
         <w:drawing>
-          <wp:inline distT="0" distB="0" distL="0" distR="0" wp14:anchorId="27BBA5CD" wp14:editId="64D46809">
+          <wp:inline distT="0" distB="0" distL="0" distR="0" wp14:anchorId="3605A6B7" wp14:editId="11D98902">
             <wp:extent cx="5334000" cy="1217839"/>
             <wp:effectExtent l="0" t="0" r="0" b="0"/>
             <wp:docPr id="86" name="Picture"/>
@@ -42935,7 +42935,7 @@
         <w:pStyle w:val="Heading2"/>
       </w:pPr>
       <w:bookmarkStart w:id="80" w:name="X9b5467225f237e4ee44d60f7d236cbdfdaa1e07"/>
-      <w:bookmarkStart w:id="81" w:name="_Toc239341189"/>
+      <w:bookmarkStart w:id="81" w:name="_Toc239341927"/>
       <w:bookmarkEnd w:id="77"/>
       <w:r>
         <w:t xml:space="preserve">3.7. </w:t>
@@ -43055,7 +43055,7 @@
           <w:noProof/>
         </w:rPr>
         <w:drawing>
-          <wp:inline distT="0" distB="0" distL="0" distR="0" wp14:anchorId="43A814CF" wp14:editId="2233267D">
+          <wp:inline distT="0" distB="0" distL="0" distR="0" wp14:anchorId="6169D2FD" wp14:editId="33D015C4">
             <wp:extent cx="5334000" cy="5953125"/>
             <wp:effectExtent l="0" t="0" r="0" b="0"/>
             <wp:docPr id="91" name="Picture"/>
@@ -44183,7 +44183,7 @@
         <w:pStyle w:val="Heading1"/>
       </w:pPr>
       <w:bookmarkStart w:id="83" w:name="chương-4-thực-nghiệm-và-đánh-giá"/>
-      <w:bookmarkStart w:id="84" w:name="_Toc239341190"/>
+      <w:bookmarkStart w:id="84" w:name="_Toc239341928"/>
       <w:bookmarkEnd w:id="50"/>
       <w:bookmarkEnd w:id="80"/>
       <w:r>
@@ -44208,7 +44208,7 @@
         <w:pStyle w:val="Heading2"/>
       </w:pPr>
       <w:bookmarkStart w:id="85" w:name="X43cb4672f728ce1df4f211c1d18360135f0c40b"/>
-      <w:bookmarkStart w:id="86" w:name="_Toc239341191"/>
+      <w:bookmarkStart w:id="86" w:name="_Toc239341929"/>
       <w:r>
         <w:t>4.1. Môi trư</w:t>
       </w:r>
@@ -45836,7 +45836,7 @@
         <w:pStyle w:val="Heading2"/>
       </w:pPr>
       <w:bookmarkStart w:id="87" w:name="Xe48430b60e6d2b1022368eb4316c1fe9f53411f"/>
-      <w:bookmarkStart w:id="88" w:name="_Toc239341192"/>
+      <w:bookmarkStart w:id="88" w:name="_Toc239341930"/>
       <w:bookmarkEnd w:id="85"/>
       <w:r>
         <w:t>4.2. K</w:t>
@@ -49368,7 +49368,7 @@
         <w:pStyle w:val="Heading2"/>
       </w:pPr>
       <w:bookmarkStart w:id="95" w:name="X09b724f0b907c7f652c2569c27ef1d5728c277c"/>
-      <w:bookmarkStart w:id="96" w:name="_Toc239341193"/>
+      <w:bookmarkStart w:id="96" w:name="_Toc239341931"/>
       <w:bookmarkEnd w:id="87"/>
       <w:bookmarkEnd w:id="93"/>
       <w:r>
@@ -51640,7 +51640,7 @@
           <w:noProof/>
         </w:rPr>
         <w:drawing>
-          <wp:inline distT="0" distB="0" distL="0" distR="0" wp14:anchorId="1F58425C" wp14:editId="17F678B3">
+          <wp:inline distT="0" distB="0" distL="0" distR="0" wp14:anchorId="50DFE295" wp14:editId="38045AED">
             <wp:extent cx="5334000" cy="2883855"/>
             <wp:effectExtent l="0" t="0" r="0" b="0"/>
             <wp:docPr id="108" name="Picture"/>
@@ -56663,7 +56663,7 @@
         <w:pStyle w:val="Heading2"/>
       </w:pPr>
       <w:bookmarkStart w:id="106" w:name="X0c205a3fd5474e5e1d380a3735df7543f97f059"/>
-      <w:bookmarkStart w:id="107" w:name="_Toc239341194"/>
+      <w:bookmarkStart w:id="107" w:name="_Toc239341932"/>
       <w:bookmarkEnd w:id="95"/>
       <w:bookmarkEnd w:id="104"/>
       <w:r>
@@ -59671,7 +59671,7 @@
         <w:pStyle w:val="Heading2"/>
       </w:pPr>
       <w:bookmarkStart w:id="113" w:name="X8f4b2c0e55e8764a0677cdfa39e96dbe6822859"/>
-      <w:bookmarkStart w:id="114" w:name="_Toc239341195"/>
+      <w:bookmarkStart w:id="114" w:name="_Toc239341933"/>
       <w:bookmarkEnd w:id="106"/>
       <w:bookmarkEnd w:id="112"/>
       <w:r>
@@ -62829,7 +62829,7 @@
         <w:pStyle w:val="Heading2"/>
       </w:pPr>
       <w:bookmarkStart w:id="120" w:name="X7468ed9f095dd0192ebc5de940dc44b5cd3e099"/>
-      <w:bookmarkStart w:id="121" w:name="_Toc239341196"/>
+      <w:bookmarkStart w:id="121" w:name="_Toc239341934"/>
       <w:bookmarkEnd w:id="113"/>
       <w:bookmarkEnd w:id="118"/>
       <w:r>
@@ -64687,7 +64687,7 @@
           <w:noProof/>
         </w:rPr>
         <w:drawing>
-          <wp:inline distT="0" distB="0" distL="0" distR="0" wp14:anchorId="6581241F" wp14:editId="2653A2D6">
+          <wp:inline distT="0" distB="0" distL="0" distR="0" wp14:anchorId="1A21060C" wp14:editId="7FF1CCED">
             <wp:extent cx="5334000" cy="3317670"/>
             <wp:effectExtent l="0" t="0" r="0" b="0"/>
             <wp:docPr id="131" name="Picture"/>
@@ -65419,7 +65419,7 @@
         <w:pStyle w:val="Heading2"/>
       </w:pPr>
       <w:bookmarkStart w:id="124" w:name="X88e1c26a6581f7bd1dbdb2c85ae6116c5ba8393"/>
-      <w:bookmarkStart w:id="125" w:name="_Toc239341197"/>
+      <w:bookmarkStart w:id="125" w:name="_Toc239341935"/>
       <w:bookmarkEnd w:id="120"/>
       <w:r>
         <w:t>4.7. Các y</w:t>
@@ -67274,7 +67274,7 @@
         <w:pStyle w:val="Heading1"/>
       </w:pPr>
       <w:bookmarkStart w:id="127" w:name="chương-5-kết-luận-và-hướng-phát-triển"/>
-      <w:bookmarkStart w:id="128" w:name="_Toc239341198"/>
+      <w:bookmarkStart w:id="128" w:name="_Toc239341936"/>
       <w:bookmarkEnd w:id="83"/>
       <w:bookmarkEnd w:id="124"/>
       <w:r>
@@ -67311,7 +67311,7 @@
         <w:pStyle w:val="Heading2"/>
       </w:pPr>
       <w:bookmarkStart w:id="129" w:name="Xcefa088882d41b38c21b7b5b44c738cb5564fbb"/>
-      <w:bookmarkStart w:id="130" w:name="_Toc239341199"/>
+      <w:bookmarkStart w:id="130" w:name="_Toc239341937"/>
       <w:r>
         <w:t>5.1. K</w:t>
       </w:r>
@@ -68812,7 +68812,7 @@
         <w:pStyle w:val="Heading2"/>
       </w:pPr>
       <w:bookmarkStart w:id="132" w:name="Xe79f58ab8ce7b6f148c68a374118dd9eaec1a1c"/>
-      <w:bookmarkStart w:id="133" w:name="_Toc239341200"/>
+      <w:bookmarkStart w:id="133" w:name="_Toc239341938"/>
       <w:bookmarkEnd w:id="129"/>
       <w:r>
         <w:t>5.2. H</w:t>
@@ -70026,7 +70026,7 @@
         <w:pStyle w:val="Heading2"/>
       </w:pPr>
       <w:bookmarkStart w:id="135" w:name="X66db71c9020c40cf46e490c5c37ad244e2b7594"/>
-      <w:bookmarkStart w:id="136" w:name="_Toc239341201"/>
+      <w:bookmarkStart w:id="136" w:name="_Toc239341939"/>
       <w:bookmarkEnd w:id="132"/>
       <w:r>
         <w:t>5.3. Hư</w:t>
@@ -71617,7 +71617,7 @@
         <w:pStyle w:val="Heading2"/>
       </w:pPr>
       <w:bookmarkStart w:id="138" w:name="Xe5a2fe3dfcd4681648271b7ddc344b106e48b3b"/>
-      <w:bookmarkStart w:id="139" w:name="_Toc239341202"/>
+      <w:bookmarkStart w:id="139" w:name="_Toc239341940"/>
       <w:bookmarkEnd w:id="135"/>
       <w:r>
         <w:t>5.4. K</w:t>
@@ -72540,7 +72540,7 @@
         <w:pStyle w:val="Heading1"/>
       </w:pPr>
       <w:bookmarkStart w:id="140" w:name="tài-liệu-tham-khảo"/>
-      <w:bookmarkStart w:id="141" w:name="_Toc239341203"/>
+      <w:bookmarkStart w:id="141" w:name="_Toc239341941"/>
       <w:bookmarkEnd w:id="127"/>
       <w:bookmarkEnd w:id="138"/>
       <w:r>
@@ -73496,7 +73496,7 @@
         <w:pStyle w:val="Heading1"/>
       </w:pPr>
       <w:bookmarkStart w:id="142" w:name="phụ-lục"/>
-      <w:bookmarkStart w:id="143" w:name="_Toc239341204"/>
+      <w:bookmarkStart w:id="143" w:name="_Toc239341942"/>
       <w:bookmarkEnd w:id="140"/>
       <w:r>
         <w:t>PH</w:t>
@@ -73520,7 +73520,7 @@
         <w:pStyle w:val="Heading2"/>
       </w:pPr>
       <w:bookmarkStart w:id="144" w:name="phụ-lục-a-cấu-hình-và-siêu-tham-số"/>
-      <w:bookmarkStart w:id="145" w:name="_Toc239341205"/>
+      <w:bookmarkStart w:id="145" w:name="_Toc239341943"/>
       <w:r>
         <w:t>Ph</w:t>
       </w:r>
@@ -75740,7 +75740,7 @@
         <w:pStyle w:val="Heading2"/>
       </w:pPr>
       <w:bookmarkStart w:id="149" w:name="phụ-lục-b-hướng-dẫn-cài-đặt-và-chạy"/>
-      <w:bookmarkStart w:id="150" w:name="_Toc239341206"/>
+      <w:bookmarkStart w:id="150" w:name="_Toc239341944"/>
       <w:bookmarkEnd w:id="144"/>
       <w:bookmarkEnd w:id="148"/>
       <w:r>
@@ -77414,7 +77414,7 @@
         <w:pStyle w:val="Heading2"/>
       </w:pPr>
       <w:bookmarkStart w:id="155" w:name="phụ-lục-c-phân-công-công-việc"/>
-      <w:bookmarkStart w:id="156" w:name="_Toc239341207"/>
+      <w:bookmarkStart w:id="156" w:name="_Toc239341945"/>
       <w:bookmarkEnd w:id="149"/>
       <w:bookmarkEnd w:id="154"/>
       <w:r>
@@ -78193,7 +78193,7 @@
   <w:abstractNum w:abstractNumId="0" w15:restartNumberingAfterBreak="0">
     <w:nsid w:val="0000A990"/>
     <w:multiLevelType w:val="multilevel"/>
-    <w:tmpl w:val="F7C035F8"/>
+    <w:tmpl w:val="348088E2"/>
     <w:lvl w:ilvl="0">
       <w:numFmt w:val="bullet"/>
       <w:lvlText w:val=" "/>
@@ -78270,7 +78270,7 @@
   <w:abstractNum w:abstractNumId="1" w15:restartNumberingAfterBreak="0">
     <w:nsid w:val="0000A991"/>
     <w:multiLevelType w:val="multilevel"/>
-    <w:tmpl w:val="8DE4F246"/>
+    <w:tmpl w:val="08D4068A"/>
     <w:lvl w:ilvl="0">
       <w:numFmt w:val="bullet"/>
       <w:lvlText w:val=""/>
@@ -78374,7 +78374,7 @@
   <w:abstractNum w:abstractNumId="2" w15:restartNumberingAfterBreak="0">
     <w:nsid w:val="00A99411"/>
     <w:multiLevelType w:val="multilevel"/>
-    <w:tmpl w:val="C4E2988A"/>
+    <w:tmpl w:val="0746502E"/>
     <w:lvl w:ilvl="0">
       <w:start w:val="1"/>
       <w:numFmt w:val="decimal"/>
@@ -78457,10 +78457,10 @@
       </w:pPr>
     </w:lvl>
   </w:abstractNum>
-  <w:num w:numId="1" w16cid:durableId="1006981140">
+  <w:num w:numId="1" w16cid:durableId="366028298">
     <w:abstractNumId w:val="0"/>
   </w:num>
-  <w:num w:numId="2" w16cid:durableId="1071076506">
+  <w:num w:numId="2" w16cid:durableId="59792964">
     <w:abstractNumId w:val="2"/>
     <w:lvlOverride w:ilvl="0">
       <w:startOverride w:val="1"/>
@@ -78490,22 +78490,22 @@
       <w:startOverride w:val="1"/>
     </w:lvlOverride>
   </w:num>
-  <w:num w:numId="3" w16cid:durableId="1638991106">
+  <w:num w:numId="3" w16cid:durableId="286743697">
     <w:abstractNumId w:val="1"/>
   </w:num>
-  <w:num w:numId="4" w16cid:durableId="1001353639">
+  <w:num w:numId="4" w16cid:durableId="563413279">
     <w:abstractNumId w:val="1"/>
   </w:num>
-  <w:num w:numId="5" w16cid:durableId="1079594036">
+  <w:num w:numId="5" w16cid:durableId="69234500">
     <w:abstractNumId w:val="1"/>
   </w:num>
-  <w:num w:numId="6" w16cid:durableId="372078496">
+  <w:num w:numId="6" w16cid:durableId="2123457633">
     <w:abstractNumId w:val="1"/>
   </w:num>
-  <w:num w:numId="7" w16cid:durableId="351299405">
+  <w:num w:numId="7" w16cid:durableId="1765028346">
     <w:abstractNumId w:val="1"/>
   </w:num>
-  <w:num w:numId="8" w16cid:durableId="537396816">
+  <w:num w:numId="8" w16cid:durableId="1826583461">
     <w:abstractNumId w:val="2"/>
     <w:lvlOverride w:ilvl="0">
       <w:startOverride w:val="1"/>
@@ -78535,7 +78535,7 @@
       <w:startOverride w:val="1"/>
     </w:lvlOverride>
   </w:num>
-  <w:num w:numId="9" w16cid:durableId="134639193">
+  <w:num w:numId="9" w16cid:durableId="659231823">
     <w:abstractNumId w:val="1"/>
   </w:num>
 </w:numbering>
@@ -79772,7 +79772,7 @@
     <w:next w:val="Normal"/>
     <w:autoRedefine/>
     <w:uiPriority w:val="39"/>
-    <w:rsid w:val="0076035D"/>
+    <w:rsid w:val="001430A3"/>
     <w:pPr>
       <w:spacing w:after="100"/>
     </w:pPr>
@@ -79783,7 +79783,7 @@
     <w:next w:val="Normal"/>
     <w:autoRedefine/>
     <w:uiPriority w:val="39"/>
-    <w:rsid w:val="0076035D"/>
+    <w:rsid w:val="001430A3"/>
     <w:pPr>
       <w:spacing w:after="100"/>
       <w:ind w:left="240"/>

</xml_diff>

<commit_message>
docs(mon-hoc): khoi phuc 4 cau nhac bang/hinh bi mat khi rut gon; docstring demo_test 1 dong
Dot kiem lai bat duoc hai hau qua cua chinh luot sua truoc:
  1. Bang 4.2, Bang 4.12, Bang 5.2 va Hinh 4.2 khong con duoc nhac trong van
     — cau nhac nam dung trong cac doan da rut gon (4.3.2, 4.6, 5.1). Them
     mot cau dan cho moi cai; nay 23/23 bang va 10/10 hinh deu duoc nhac.
  2. scripts/demo_test.py (viet 03/09) co hai docstring nhieu dong, trai quy
     uoc mot dong cua kho. Rut ve mot dong, ly do chuyen thanh chu thich #.

Kiem: refs 0 chet, PDF 42 trang, PAGEREF khac 0, check_slides 16/0, ruff sach,
33/33 phep so hoc tren moi bang dat.
</commit_message>
<xml_diff>
--- a/nop/01-do-an-mon-hoc.docx
+++ b/nop/01-do-an-mon-hoc.docx
@@ -829,7 +829,7 @@
       <w:r>
         <w:fldChar w:fldCharType="separate"/>
       </w:r>
-      <w:hyperlink w:anchor="_Toc239348927" w:history="1">
+      <w:hyperlink w:anchor="_Toc239403571" w:history="1">
         <w:r>
           <w:rPr>
             <w:rStyle w:val="Hyperlink"/>
@@ -856,7 +856,7 @@
             <w:noProof/>
             <w:webHidden/>
           </w:rPr>
-          <w:instrText xml:space="preserve"> PAGEREF _Toc239348927 \h </w:instrText>
+          <w:instrText xml:space="preserve"> PAGEREF _Toc239403571 \h </w:instrText>
         </w:r>
         <w:r>
           <w:rPr>
@@ -900,7 +900,7 @@
           <w14:ligatures w14:val="standardContextual"/>
         </w:rPr>
       </w:pPr>
-      <w:hyperlink w:anchor="_Toc239348928" w:history="1">
+      <w:hyperlink w:anchor="_Toc239403572" w:history="1">
         <w:r>
           <w:rPr>
             <w:rStyle w:val="Hyperlink"/>
@@ -927,7 +927,7 @@
             <w:noProof/>
             <w:webHidden/>
           </w:rPr>
-          <w:instrText xml:space="preserve"> PAGEREF _Toc239348928 \h </w:instrText>
+          <w:instrText xml:space="preserve"> PAGEREF _Toc239403572 \h </w:instrText>
         </w:r>
         <w:r>
           <w:rPr>
@@ -971,7 +971,7 @@
           <w14:ligatures w14:val="standardContextual"/>
         </w:rPr>
       </w:pPr>
-      <w:hyperlink w:anchor="_Toc239348929" w:history="1">
+      <w:hyperlink w:anchor="_Toc239403573" w:history="1">
         <w:r>
           <w:rPr>
             <w:rStyle w:val="Hyperlink"/>
@@ -998,7 +998,7 @@
             <w:noProof/>
             <w:webHidden/>
           </w:rPr>
-          <w:instrText xml:space="preserve"> PAGEREF _Toc239348929 \h </w:instrText>
+          <w:instrText xml:space="preserve"> PAGEREF _Toc239403573 \h </w:instrText>
         </w:r>
         <w:r>
           <w:rPr>
@@ -1042,7 +1042,7 @@
           <w14:ligatures w14:val="standardContextual"/>
         </w:rPr>
       </w:pPr>
-      <w:hyperlink w:anchor="_Toc239348930" w:history="1">
+      <w:hyperlink w:anchor="_Toc239403574" w:history="1">
         <w:r>
           <w:rPr>
             <w:rStyle w:val="Hyperlink"/>
@@ -1069,7 +1069,7 @@
             <w:noProof/>
             <w:webHidden/>
           </w:rPr>
-          <w:instrText xml:space="preserve"> PAGEREF _Toc239348930 \h </w:instrText>
+          <w:instrText xml:space="preserve"> PAGEREF _Toc239403574 \h </w:instrText>
         </w:r>
         <w:r>
           <w:rPr>
@@ -1113,7 +1113,7 @@
           <w14:ligatures w14:val="standardContextual"/>
         </w:rPr>
       </w:pPr>
-      <w:hyperlink w:anchor="_Toc239348931" w:history="1">
+      <w:hyperlink w:anchor="_Toc239403575" w:history="1">
         <w:r>
           <w:rPr>
             <w:rStyle w:val="Hyperlink"/>
@@ -1140,7 +1140,7 @@
             <w:noProof/>
             <w:webHidden/>
           </w:rPr>
-          <w:instrText xml:space="preserve"> PAGEREF _Toc239348931 \h </w:instrText>
+          <w:instrText xml:space="preserve"> PAGEREF _Toc239403575 \h </w:instrText>
         </w:r>
         <w:r>
           <w:rPr>
@@ -1184,7 +1184,7 @@
           <w14:ligatures w14:val="standardContextual"/>
         </w:rPr>
       </w:pPr>
-      <w:hyperlink w:anchor="_Toc239348932" w:history="1">
+      <w:hyperlink w:anchor="_Toc239403576" w:history="1">
         <w:r>
           <w:rPr>
             <w:rStyle w:val="Hyperlink"/>
@@ -1211,7 +1211,7 @@
             <w:noProof/>
             <w:webHidden/>
           </w:rPr>
-          <w:instrText xml:space="preserve"> PAGEREF _Toc239348932 \h </w:instrText>
+          <w:instrText xml:space="preserve"> PAGEREF _Toc239403576 \h </w:instrText>
         </w:r>
         <w:r>
           <w:rPr>
@@ -1255,7 +1255,7 @@
           <w14:ligatures w14:val="standardContextual"/>
         </w:rPr>
       </w:pPr>
-      <w:hyperlink w:anchor="_Toc239348933" w:history="1">
+      <w:hyperlink w:anchor="_Toc239403577" w:history="1">
         <w:r>
           <w:rPr>
             <w:rStyle w:val="Hyperlink"/>
@@ -1282,7 +1282,7 @@
             <w:noProof/>
             <w:webHidden/>
           </w:rPr>
-          <w:instrText xml:space="preserve"> PAGEREF _Toc239348933 \h </w:instrText>
+          <w:instrText xml:space="preserve"> PAGEREF _Toc239403577 \h </w:instrText>
         </w:r>
         <w:r>
           <w:rPr>
@@ -1326,7 +1326,7 @@
           <w14:ligatures w14:val="standardContextual"/>
         </w:rPr>
       </w:pPr>
-      <w:hyperlink w:anchor="_Toc239348934" w:history="1">
+      <w:hyperlink w:anchor="_Toc239403578" w:history="1">
         <w:r>
           <w:rPr>
             <w:rStyle w:val="Hyperlink"/>
@@ -1353,7 +1353,7 @@
             <w:noProof/>
             <w:webHidden/>
           </w:rPr>
-          <w:instrText xml:space="preserve"> PAGEREF _Toc239348934 \h </w:instrText>
+          <w:instrText xml:space="preserve"> PAGEREF _Toc239403578 \h </w:instrText>
         </w:r>
         <w:r>
           <w:rPr>
@@ -1397,7 +1397,7 @@
           <w14:ligatures w14:val="standardContextual"/>
         </w:rPr>
       </w:pPr>
-      <w:hyperlink w:anchor="_Toc239348935" w:history="1">
+      <w:hyperlink w:anchor="_Toc239403579" w:history="1">
         <w:r>
           <w:rPr>
             <w:rStyle w:val="Hyperlink"/>
@@ -1424,7 +1424,7 @@
             <w:noProof/>
             <w:webHidden/>
           </w:rPr>
-          <w:instrText xml:space="preserve"> PAGEREF _Toc239348935 \h </w:instrText>
+          <w:instrText xml:space="preserve"> PAGEREF _Toc239403579 \h </w:instrText>
         </w:r>
         <w:r>
           <w:rPr>
@@ -1468,7 +1468,7 @@
           <w14:ligatures w14:val="standardContextual"/>
         </w:rPr>
       </w:pPr>
-      <w:hyperlink w:anchor="_Toc239348936" w:history="1">
+      <w:hyperlink w:anchor="_Toc239403580" w:history="1">
         <w:r>
           <w:rPr>
             <w:rStyle w:val="Hyperlink"/>
@@ -1495,7 +1495,7 @@
             <w:noProof/>
             <w:webHidden/>
           </w:rPr>
-          <w:instrText xml:space="preserve"> PAGEREF _Toc239348936 \h </w:instrText>
+          <w:instrText xml:space="preserve"> PAGEREF _Toc239403580 \h </w:instrText>
         </w:r>
         <w:r>
           <w:rPr>
@@ -1539,7 +1539,7 @@
           <w14:ligatures w14:val="standardContextual"/>
         </w:rPr>
       </w:pPr>
-      <w:hyperlink w:anchor="_Toc239348937" w:history="1">
+      <w:hyperlink w:anchor="_Toc239403581" w:history="1">
         <w:r>
           <w:rPr>
             <w:rStyle w:val="Hyperlink"/>
@@ -1566,7 +1566,7 @@
             <w:noProof/>
             <w:webHidden/>
           </w:rPr>
-          <w:instrText xml:space="preserve"> PAGEREF _Toc239348937 \h </w:instrText>
+          <w:instrText xml:space="preserve"> PAGEREF _Toc239403581 \h </w:instrText>
         </w:r>
         <w:r>
           <w:rPr>
@@ -1610,7 +1610,7 @@
           <w14:ligatures w14:val="standardContextual"/>
         </w:rPr>
       </w:pPr>
-      <w:hyperlink w:anchor="_Toc239348938" w:history="1">
+      <w:hyperlink w:anchor="_Toc239403582" w:history="1">
         <w:r>
           <w:rPr>
             <w:rStyle w:val="Hyperlink"/>
@@ -1637,7 +1637,7 @@
             <w:noProof/>
             <w:webHidden/>
           </w:rPr>
-          <w:instrText xml:space="preserve"> PAGEREF _Toc239348938 \h </w:instrText>
+          <w:instrText xml:space="preserve"> PAGEREF _Toc239403582 \h </w:instrText>
         </w:r>
         <w:r>
           <w:rPr>
@@ -1681,7 +1681,7 @@
           <w14:ligatures w14:val="standardContextual"/>
         </w:rPr>
       </w:pPr>
-      <w:hyperlink w:anchor="_Toc239348939" w:history="1">
+      <w:hyperlink w:anchor="_Toc239403583" w:history="1">
         <w:r>
           <w:rPr>
             <w:rStyle w:val="Hyperlink"/>
@@ -1708,7 +1708,7 @@
             <w:noProof/>
             <w:webHidden/>
           </w:rPr>
-          <w:instrText xml:space="preserve"> PAGEREF _Toc239348939 \h </w:instrText>
+          <w:instrText xml:space="preserve"> PAGEREF _Toc239403583 \h </w:instrText>
         </w:r>
         <w:r>
           <w:rPr>
@@ -1752,7 +1752,7 @@
           <w14:ligatures w14:val="standardContextual"/>
         </w:rPr>
       </w:pPr>
-      <w:hyperlink w:anchor="_Toc239348940" w:history="1">
+      <w:hyperlink w:anchor="_Toc239403584" w:history="1">
         <w:r>
           <w:rPr>
             <w:rStyle w:val="Hyperlink"/>
@@ -1779,7 +1779,7 @@
             <w:noProof/>
             <w:webHidden/>
           </w:rPr>
-          <w:instrText xml:space="preserve"> PAGEREF _Toc239348940 \h </w:instrText>
+          <w:instrText xml:space="preserve"> PAGEREF _Toc239403584 \h </w:instrText>
         </w:r>
         <w:r>
           <w:rPr>
@@ -1823,7 +1823,7 @@
           <w14:ligatures w14:val="standardContextual"/>
         </w:rPr>
       </w:pPr>
-      <w:hyperlink w:anchor="_Toc239348941" w:history="1">
+      <w:hyperlink w:anchor="_Toc239403585" w:history="1">
         <w:r>
           <w:rPr>
             <w:rStyle w:val="Hyperlink"/>
@@ -1850,7 +1850,7 @@
             <w:noProof/>
             <w:webHidden/>
           </w:rPr>
-          <w:instrText xml:space="preserve"> PAGEREF _Toc239348941 \h </w:instrText>
+          <w:instrText xml:space="preserve"> PAGEREF _Toc239403585 \h </w:instrText>
         </w:r>
         <w:r>
           <w:rPr>
@@ -1894,7 +1894,7 @@
           <w14:ligatures w14:val="standardContextual"/>
         </w:rPr>
       </w:pPr>
-      <w:hyperlink w:anchor="_Toc239348942" w:history="1">
+      <w:hyperlink w:anchor="_Toc239403586" w:history="1">
         <w:r>
           <w:rPr>
             <w:rStyle w:val="Hyperlink"/>
@@ -1921,7 +1921,7 @@
             <w:noProof/>
             <w:webHidden/>
           </w:rPr>
-          <w:instrText xml:space="preserve"> PAGEREF _Toc239348942 \h </w:instrText>
+          <w:instrText xml:space="preserve"> PAGEREF _Toc239403586 \h </w:instrText>
         </w:r>
         <w:r>
           <w:rPr>
@@ -1965,7 +1965,7 @@
           <w14:ligatures w14:val="standardContextual"/>
         </w:rPr>
       </w:pPr>
-      <w:hyperlink w:anchor="_Toc239348943" w:history="1">
+      <w:hyperlink w:anchor="_Toc239403587" w:history="1">
         <w:r>
           <w:rPr>
             <w:rStyle w:val="Hyperlink"/>
@@ -1992,7 +1992,7 @@
             <w:noProof/>
             <w:webHidden/>
           </w:rPr>
-          <w:instrText xml:space="preserve"> PAGEREF _Toc239348943 \h </w:instrText>
+          <w:instrText xml:space="preserve"> PAGEREF _Toc239403587 \h </w:instrText>
         </w:r>
         <w:r>
           <w:rPr>
@@ -2036,7 +2036,7 @@
           <w14:ligatures w14:val="standardContextual"/>
         </w:rPr>
       </w:pPr>
-      <w:hyperlink w:anchor="_Toc239348944" w:history="1">
+      <w:hyperlink w:anchor="_Toc239403588" w:history="1">
         <w:r>
           <w:rPr>
             <w:rStyle w:val="Hyperlink"/>
@@ -2063,7 +2063,7 @@
             <w:noProof/>
             <w:webHidden/>
           </w:rPr>
-          <w:instrText xml:space="preserve"> PAGEREF _Toc239348944 \h </w:instrText>
+          <w:instrText xml:space="preserve"> PAGEREF _Toc239403588 \h </w:instrText>
         </w:r>
         <w:r>
           <w:rPr>
@@ -2107,7 +2107,7 @@
           <w14:ligatures w14:val="standardContextual"/>
         </w:rPr>
       </w:pPr>
-      <w:hyperlink w:anchor="_Toc239348945" w:history="1">
+      <w:hyperlink w:anchor="_Toc239403589" w:history="1">
         <w:r>
           <w:rPr>
             <w:rStyle w:val="Hyperlink"/>
@@ -2134,7 +2134,7 @@
             <w:noProof/>
             <w:webHidden/>
           </w:rPr>
-          <w:instrText xml:space="preserve"> PAGEREF _Toc239348945 \h </w:instrText>
+          <w:instrText xml:space="preserve"> PAGEREF _Toc239403589 \h </w:instrText>
         </w:r>
         <w:r>
           <w:rPr>
@@ -2178,7 +2178,7 @@
           <w14:ligatures w14:val="standardContextual"/>
         </w:rPr>
       </w:pPr>
-      <w:hyperlink w:anchor="_Toc239348946" w:history="1">
+      <w:hyperlink w:anchor="_Toc239403590" w:history="1">
         <w:r>
           <w:rPr>
             <w:rStyle w:val="Hyperlink"/>
@@ -2205,7 +2205,7 @@
             <w:noProof/>
             <w:webHidden/>
           </w:rPr>
-          <w:instrText xml:space="preserve"> PAGEREF _Toc239348946 \h </w:instrText>
+          <w:instrText xml:space="preserve"> PAGEREF _Toc239403590 \h </w:instrText>
         </w:r>
         <w:r>
           <w:rPr>
@@ -2249,7 +2249,7 @@
           <w14:ligatures w14:val="standardContextual"/>
         </w:rPr>
       </w:pPr>
-      <w:hyperlink w:anchor="_Toc239348947" w:history="1">
+      <w:hyperlink w:anchor="_Toc239403591" w:history="1">
         <w:r>
           <w:rPr>
             <w:rStyle w:val="Hyperlink"/>
@@ -2276,7 +2276,7 @@
             <w:noProof/>
             <w:webHidden/>
           </w:rPr>
-          <w:instrText xml:space="preserve"> PAGEREF _Toc239348947 \h </w:instrText>
+          <w:instrText xml:space="preserve"> PAGEREF _Toc239403591 \h </w:instrText>
         </w:r>
         <w:r>
           <w:rPr>
@@ -2320,7 +2320,7 @@
           <w14:ligatures w14:val="standardContextual"/>
         </w:rPr>
       </w:pPr>
-      <w:hyperlink w:anchor="_Toc239348948" w:history="1">
+      <w:hyperlink w:anchor="_Toc239403592" w:history="1">
         <w:r>
           <w:rPr>
             <w:rStyle w:val="Hyperlink"/>
@@ -2347,7 +2347,7 @@
             <w:noProof/>
             <w:webHidden/>
           </w:rPr>
-          <w:instrText xml:space="preserve"> PAGEREF _Toc239348948 \h </w:instrText>
+          <w:instrText xml:space="preserve"> PAGEREF _Toc239403592 \h </w:instrText>
         </w:r>
         <w:r>
           <w:rPr>
@@ -2391,7 +2391,7 @@
           <w14:ligatures w14:val="standardContextual"/>
         </w:rPr>
       </w:pPr>
-      <w:hyperlink w:anchor="_Toc239348949" w:history="1">
+      <w:hyperlink w:anchor="_Toc239403593" w:history="1">
         <w:r>
           <w:rPr>
             <w:rStyle w:val="Hyperlink"/>
@@ -2418,7 +2418,7 @@
             <w:noProof/>
             <w:webHidden/>
           </w:rPr>
-          <w:instrText xml:space="preserve"> PAGEREF _Toc239348949 \h </w:instrText>
+          <w:instrText xml:space="preserve"> PAGEREF _Toc239403593 \h </w:instrText>
         </w:r>
         <w:r>
           <w:rPr>
@@ -2462,7 +2462,7 @@
           <w14:ligatures w14:val="standardContextual"/>
         </w:rPr>
       </w:pPr>
-      <w:hyperlink w:anchor="_Toc239348950" w:history="1">
+      <w:hyperlink w:anchor="_Toc239403594" w:history="1">
         <w:r>
           <w:rPr>
             <w:rStyle w:val="Hyperlink"/>
@@ -2489,7 +2489,7 @@
             <w:noProof/>
             <w:webHidden/>
           </w:rPr>
-          <w:instrText xml:space="preserve"> PAGEREF _Toc239348950 \h </w:instrText>
+          <w:instrText xml:space="preserve"> PAGEREF _Toc239403594 \h </w:instrText>
         </w:r>
         <w:r>
           <w:rPr>
@@ -2533,7 +2533,7 @@
           <w14:ligatures w14:val="standardContextual"/>
         </w:rPr>
       </w:pPr>
-      <w:hyperlink w:anchor="_Toc239348951" w:history="1">
+      <w:hyperlink w:anchor="_Toc239403595" w:history="1">
         <w:r>
           <w:rPr>
             <w:rStyle w:val="Hyperlink"/>
@@ -2560,7 +2560,7 @@
             <w:noProof/>
             <w:webHidden/>
           </w:rPr>
-          <w:instrText xml:space="preserve"> PAGEREF _Toc239348951 \h </w:instrText>
+          <w:instrText xml:space="preserve"> PAGEREF _Toc239403595 \h </w:instrText>
         </w:r>
         <w:r>
           <w:rPr>
@@ -2604,7 +2604,7 @@
           <w14:ligatures w14:val="standardContextual"/>
         </w:rPr>
       </w:pPr>
-      <w:hyperlink w:anchor="_Toc239348952" w:history="1">
+      <w:hyperlink w:anchor="_Toc239403596" w:history="1">
         <w:r>
           <w:rPr>
             <w:rStyle w:val="Hyperlink"/>
@@ -2631,7 +2631,7 @@
             <w:noProof/>
             <w:webHidden/>
           </w:rPr>
-          <w:instrText xml:space="preserve"> PAGEREF _Toc239348952 \h </w:instrText>
+          <w:instrText xml:space="preserve"> PAGEREF _Toc239403596 \h </w:instrText>
         </w:r>
         <w:r>
           <w:rPr>
@@ -2675,7 +2675,7 @@
           <w14:ligatures w14:val="standardContextual"/>
         </w:rPr>
       </w:pPr>
-      <w:hyperlink w:anchor="_Toc239348953" w:history="1">
+      <w:hyperlink w:anchor="_Toc239403597" w:history="1">
         <w:r>
           <w:rPr>
             <w:rStyle w:val="Hyperlink"/>
@@ -2702,7 +2702,7 @@
             <w:noProof/>
             <w:webHidden/>
           </w:rPr>
-          <w:instrText xml:space="preserve"> PAGEREF _Toc239348953 \h </w:instrText>
+          <w:instrText xml:space="preserve"> PAGEREF _Toc239403597 \h </w:instrText>
         </w:r>
         <w:r>
           <w:rPr>
@@ -2746,7 +2746,7 @@
           <w14:ligatures w14:val="standardContextual"/>
         </w:rPr>
       </w:pPr>
-      <w:hyperlink w:anchor="_Toc239348954" w:history="1">
+      <w:hyperlink w:anchor="_Toc239403598" w:history="1">
         <w:r>
           <w:rPr>
             <w:rStyle w:val="Hyperlink"/>
@@ -2773,7 +2773,7 @@
             <w:noProof/>
             <w:webHidden/>
           </w:rPr>
-          <w:instrText xml:space="preserve"> PAGEREF _Toc239348954 \h </w:instrText>
+          <w:instrText xml:space="preserve"> PAGEREF _Toc239403598 \h </w:instrText>
         </w:r>
         <w:r>
           <w:rPr>
@@ -2817,7 +2817,7 @@
           <w14:ligatures w14:val="standardContextual"/>
         </w:rPr>
       </w:pPr>
-      <w:hyperlink w:anchor="_Toc239348955" w:history="1">
+      <w:hyperlink w:anchor="_Toc239403599" w:history="1">
         <w:r>
           <w:rPr>
             <w:rStyle w:val="Hyperlink"/>
@@ -2844,7 +2844,7 @@
             <w:noProof/>
             <w:webHidden/>
           </w:rPr>
-          <w:instrText xml:space="preserve"> PAGEREF _Toc239348955 \h </w:instrText>
+          <w:instrText xml:space="preserve"> PAGEREF _Toc239403599 \h </w:instrText>
         </w:r>
         <w:r>
           <w:rPr>
@@ -2888,7 +2888,7 @@
           <w14:ligatures w14:val="standardContextual"/>
         </w:rPr>
       </w:pPr>
-      <w:hyperlink w:anchor="_Toc239348956" w:history="1">
+      <w:hyperlink w:anchor="_Toc239403600" w:history="1">
         <w:r>
           <w:rPr>
             <w:rStyle w:val="Hyperlink"/>
@@ -2915,7 +2915,7 @@
             <w:noProof/>
             <w:webHidden/>
           </w:rPr>
-          <w:instrText xml:space="preserve"> PAGEREF _Toc239348956 \h </w:instrText>
+          <w:instrText xml:space="preserve"> PAGEREF _Toc239403600 \h </w:instrText>
         </w:r>
         <w:r>
           <w:rPr>
@@ -2959,7 +2959,7 @@
           <w14:ligatures w14:val="standardContextual"/>
         </w:rPr>
       </w:pPr>
-      <w:hyperlink w:anchor="_Toc239348957" w:history="1">
+      <w:hyperlink w:anchor="_Toc239403601" w:history="1">
         <w:r>
           <w:rPr>
             <w:rStyle w:val="Hyperlink"/>
@@ -2986,7 +2986,7 @@
             <w:noProof/>
             <w:webHidden/>
           </w:rPr>
-          <w:instrText xml:space="preserve"> PAGEREF _Toc239348957 \h </w:instrText>
+          <w:instrText xml:space="preserve"> PAGEREF _Toc239403601 \h </w:instrText>
         </w:r>
         <w:r>
           <w:rPr>
@@ -3030,7 +3030,7 @@
           <w14:ligatures w14:val="standardContextual"/>
         </w:rPr>
       </w:pPr>
-      <w:hyperlink w:anchor="_Toc239348958" w:history="1">
+      <w:hyperlink w:anchor="_Toc239403602" w:history="1">
         <w:r>
           <w:rPr>
             <w:rStyle w:val="Hyperlink"/>
@@ -3057,7 +3057,7 @@
             <w:noProof/>
             <w:webHidden/>
           </w:rPr>
-          <w:instrText xml:space="preserve"> PAGEREF _Toc239348958 \h </w:instrText>
+          <w:instrText xml:space="preserve"> PAGEREF _Toc239403602 \h </w:instrText>
         </w:r>
         <w:r>
           <w:rPr>
@@ -3101,7 +3101,7 @@
           <w14:ligatures w14:val="standardContextual"/>
         </w:rPr>
       </w:pPr>
-      <w:hyperlink w:anchor="_Toc239348959" w:history="1">
+      <w:hyperlink w:anchor="_Toc239403603" w:history="1">
         <w:r>
           <w:rPr>
             <w:rStyle w:val="Hyperlink"/>
@@ -3128,7 +3128,7 @@
             <w:noProof/>
             <w:webHidden/>
           </w:rPr>
-          <w:instrText xml:space="preserve"> PAGEREF _Toc239348959 \h </w:instrText>
+          <w:instrText xml:space="preserve"> PAGEREF _Toc239403603 \h </w:instrText>
         </w:r>
         <w:r>
           <w:rPr>
@@ -3172,7 +3172,7 @@
           <w14:ligatures w14:val="standardContextual"/>
         </w:rPr>
       </w:pPr>
-      <w:hyperlink w:anchor="_Toc239348960" w:history="1">
+      <w:hyperlink w:anchor="_Toc239403604" w:history="1">
         <w:r>
           <w:rPr>
             <w:rStyle w:val="Hyperlink"/>
@@ -3199,7 +3199,7 @@
             <w:noProof/>
             <w:webHidden/>
           </w:rPr>
-          <w:instrText xml:space="preserve"> PAGEREF _Toc239348960 \h </w:instrText>
+          <w:instrText xml:space="preserve"> PAGEREF _Toc239403604 \h </w:instrText>
         </w:r>
         <w:r>
           <w:rPr>
@@ -3243,7 +3243,7 @@
           <w14:ligatures w14:val="standardContextual"/>
         </w:rPr>
       </w:pPr>
-      <w:hyperlink w:anchor="_Toc239348961" w:history="1">
+      <w:hyperlink w:anchor="_Toc239403605" w:history="1">
         <w:r>
           <w:rPr>
             <w:rStyle w:val="Hyperlink"/>
@@ -3270,7 +3270,7 @@
             <w:noProof/>
             <w:webHidden/>
           </w:rPr>
-          <w:instrText xml:space="preserve"> PAGEREF _Toc239348961 \h </w:instrText>
+          <w:instrText xml:space="preserve"> PAGEREF _Toc239403605 \h </w:instrText>
         </w:r>
         <w:r>
           <w:rPr>
@@ -3316,7 +3316,7 @@
         <w:pStyle w:val="Heading1"/>
       </w:pPr>
       <w:bookmarkStart w:id="0" w:name="chương-1-giới-thiệu"/>
-      <w:bookmarkStart w:id="1" w:name="_Toc239348927"/>
+      <w:bookmarkStart w:id="1" w:name="_Toc239403571"/>
       <w:r>
         <w:t>CHƯƠNG 1. GI</w:t>
       </w:r>
@@ -3339,7 +3339,7 @@
         <w:pStyle w:val="Heading2"/>
       </w:pPr>
       <w:bookmarkStart w:id="2" w:name="X7d99df2d9d0c5141050eb9941026463f4c8ea2b"/>
-      <w:bookmarkStart w:id="3" w:name="_Toc239348928"/>
+      <w:bookmarkStart w:id="3" w:name="_Toc239403572"/>
       <w:r>
         <w:t>1.1. Đ</w:t>
       </w:r>
@@ -5228,7 +5228,7 @@
         <w:pStyle w:val="Heading2"/>
       </w:pPr>
       <w:bookmarkStart w:id="4" w:name="X60021b7b958505251ec70bd32e2bac9f8a0361c"/>
-      <w:bookmarkStart w:id="5" w:name="_Toc239348929"/>
+      <w:bookmarkStart w:id="5" w:name="_Toc239403573"/>
       <w:bookmarkEnd w:id="2"/>
       <w:r>
         <w:t>1.2. M</w:t>
@@ -7216,7 +7216,7 @@
         <w:pStyle w:val="Heading2"/>
       </w:pPr>
       <w:bookmarkStart w:id="9" w:name="X03724c88a1b7da9b434cf0a8db5356690a4bb71"/>
-      <w:bookmarkStart w:id="10" w:name="_Toc239348930"/>
+      <w:bookmarkStart w:id="10" w:name="_Toc239403574"/>
       <w:bookmarkEnd w:id="4"/>
       <w:bookmarkEnd w:id="8"/>
       <w:r>
@@ -9024,7 +9024,7 @@
         <w:pStyle w:val="Heading1"/>
       </w:pPr>
       <w:bookmarkStart w:id="12" w:name="chương-2-cơ-sở-lý-thuyết"/>
-      <w:bookmarkStart w:id="13" w:name="_Toc239348931"/>
+      <w:bookmarkStart w:id="13" w:name="_Toc239403575"/>
       <w:bookmarkEnd w:id="0"/>
       <w:bookmarkEnd w:id="9"/>
       <w:r>
@@ -9321,7 +9321,7 @@
         <w:pStyle w:val="Heading2"/>
       </w:pPr>
       <w:bookmarkStart w:id="14" w:name="X2256001523e16d112c59df938522f140b8b988e"/>
-      <w:bookmarkStart w:id="15" w:name="_Toc239348932"/>
+      <w:bookmarkStart w:id="15" w:name="_Toc239403576"/>
       <w:r>
         <w:t>2.1. Quy chu</w:t>
       </w:r>
@@ -14026,7 +14026,7 @@
         <w:pStyle w:val="Heading2"/>
       </w:pPr>
       <w:bookmarkStart w:id="22" w:name="Xb21b4f0690a73e92e2a35192cb39315a0956521"/>
-      <w:bookmarkStart w:id="23" w:name="_Toc239348933"/>
+      <w:bookmarkStart w:id="23" w:name="_Toc239403577"/>
       <w:bookmarkEnd w:id="14"/>
       <w:bookmarkEnd w:id="20"/>
       <w:r>
@@ -19266,7 +19266,7 @@
         <w:pStyle w:val="Heading2"/>
       </w:pPr>
       <w:bookmarkStart w:id="30" w:name="X8ff52f1334e3f0e382caf7ffa1b7096a981291c"/>
-      <w:bookmarkStart w:id="31" w:name="_Toc239348934"/>
+      <w:bookmarkStart w:id="31" w:name="_Toc239403578"/>
       <w:bookmarkEnd w:id="22"/>
       <w:bookmarkEnd w:id="29"/>
       <w:r>
@@ -19545,7 +19545,7 @@
           <w:noProof/>
         </w:rPr>
         <w:drawing>
-          <wp:inline distT="0" distB="0" distL="0" distR="0" wp14:anchorId="6C3154E9" wp14:editId="3B934CAE">
+          <wp:inline distT="0" distB="0" distL="0" distR="0" wp14:anchorId="1C6B5A10" wp14:editId="5D6AE74F">
             <wp:extent cx="5334000" cy="1435553"/>
             <wp:effectExtent l="0" t="0" r="0" b="0"/>
             <wp:docPr id="32" name="Picture"/>
@@ -21007,7 +21007,7 @@
         <w:pStyle w:val="Heading2"/>
       </w:pPr>
       <w:bookmarkStart w:id="35" w:name="X1a77f36e16d4ad267b00eabe7cf793e1dbe08e9"/>
-      <w:bookmarkStart w:id="36" w:name="_Toc239348935"/>
+      <w:bookmarkStart w:id="36" w:name="_Toc239403579"/>
       <w:bookmarkEnd w:id="30"/>
       <w:bookmarkEnd w:id="34"/>
       <w:r>
@@ -22177,7 +22177,7 @@
           <w:noProof/>
         </w:rPr>
         <w:drawing>
-          <wp:inline distT="0" distB="0" distL="0" distR="0" wp14:anchorId="1CF1878E" wp14:editId="78EA0BFA">
+          <wp:inline distT="0" distB="0" distL="0" distR="0" wp14:anchorId="6938B72F" wp14:editId="3FD87F15">
             <wp:extent cx="5334000" cy="2884362"/>
             <wp:effectExtent l="0" t="0" r="0" b="0"/>
             <wp:docPr id="39" name="Picture"/>
@@ -22279,7 +22279,7 @@
           <w:noProof/>
         </w:rPr>
         <w:drawing>
-          <wp:inline distT="0" distB="0" distL="0" distR="0" wp14:anchorId="45DA7B44" wp14:editId="69B7CCDF">
+          <wp:inline distT="0" distB="0" distL="0" distR="0" wp14:anchorId="6F902FE1" wp14:editId="0989B01F">
             <wp:extent cx="5334000" cy="632732"/>
             <wp:effectExtent l="0" t="0" r="0" b="0"/>
             <wp:docPr id="44" name="Picture"/>
@@ -24182,7 +24182,7 @@
         <w:pStyle w:val="Heading1"/>
       </w:pPr>
       <w:bookmarkStart w:id="42" w:name="chương-3-thiết-kế-và-cài-đặt"/>
-      <w:bookmarkStart w:id="43" w:name="_Toc239348936"/>
+      <w:bookmarkStart w:id="43" w:name="_Toc239403580"/>
       <w:bookmarkEnd w:id="12"/>
       <w:bookmarkEnd w:id="35"/>
       <w:bookmarkEnd w:id="41"/>
@@ -24214,7 +24214,7 @@
         <w:pStyle w:val="Heading2"/>
       </w:pPr>
       <w:bookmarkStart w:id="44" w:name="X21a22cc9b66dca004f2960f37df13c53a04e97b"/>
-      <w:bookmarkStart w:id="45" w:name="_Toc239348937"/>
+      <w:bookmarkStart w:id="45" w:name="_Toc239403581"/>
       <w:r>
         <w:t>3.1. Ki</w:t>
       </w:r>
@@ -24306,7 +24306,7 @@
           <w:noProof/>
         </w:rPr>
         <w:drawing>
-          <wp:inline distT="0" distB="0" distL="0" distR="0" wp14:anchorId="4B3B79CD" wp14:editId="43BC91CD">
+          <wp:inline distT="0" distB="0" distL="0" distR="0" wp14:anchorId="02363F9A" wp14:editId="76329C1B">
             <wp:extent cx="5334000" cy="401410"/>
             <wp:effectExtent l="0" t="0" r="0" b="0"/>
             <wp:docPr id="52" name="Picture"/>
@@ -25966,7 +25966,7 @@
         <w:pStyle w:val="Heading2"/>
       </w:pPr>
       <w:bookmarkStart w:id="47" w:name="X1f307d8f8c73bce8db8683c986faea6c8ea66a3"/>
-      <w:bookmarkStart w:id="48" w:name="_Toc239348938"/>
+      <w:bookmarkStart w:id="48" w:name="_Toc239403582"/>
       <w:bookmarkEnd w:id="44"/>
       <w:r>
         <w:t>3.2. Xây d</w:t>
@@ -26033,7 +26033,7 @@
           <w:noProof/>
         </w:rPr>
         <w:drawing>
-          <wp:inline distT="0" distB="0" distL="0" distR="0" wp14:anchorId="343247A1" wp14:editId="07F2C362">
+          <wp:inline distT="0" distB="0" distL="0" distR="0" wp14:anchorId="0E9BBB9D" wp14:editId="07792D90">
             <wp:extent cx="5334000" cy="802821"/>
             <wp:effectExtent l="0" t="0" r="0" b="0"/>
             <wp:docPr id="57" name="Picture"/>
@@ -30326,7 +30326,7 @@
         <w:pStyle w:val="Heading2"/>
       </w:pPr>
       <w:bookmarkStart w:id="54" w:name="X6a397cb1739f1ec0a8c9714808f79a5ce1fbf6f"/>
-      <w:bookmarkStart w:id="55" w:name="_Toc239348939"/>
+      <w:bookmarkStart w:id="55" w:name="_Toc239403583"/>
       <w:bookmarkEnd w:id="47"/>
       <w:bookmarkEnd w:id="53"/>
       <w:r>
@@ -31895,7 +31895,7 @@
         <w:pStyle w:val="Heading2"/>
       </w:pPr>
       <w:bookmarkStart w:id="57" w:name="X9c2c9b365086d10c999a46e4942f14d73b6baa5"/>
-      <w:bookmarkStart w:id="58" w:name="_Toc239348940"/>
+      <w:bookmarkStart w:id="58" w:name="_Toc239403584"/>
       <w:bookmarkEnd w:id="54"/>
       <w:r>
         <w:t>3.4. Kh</w:t>
@@ -32679,7 +32679,7 @@
           <w:noProof/>
         </w:rPr>
         <w:drawing>
-          <wp:inline distT="0" distB="0" distL="0" distR="0" wp14:anchorId="073E3C8E" wp14:editId="79A5BEAB">
+          <wp:inline distT="0" distB="0" distL="0" distR="0" wp14:anchorId="4ED59147" wp14:editId="723331D3">
             <wp:extent cx="5334000" cy="8969712"/>
             <wp:effectExtent l="0" t="0" r="0" b="0"/>
             <wp:docPr id="68" name="Picture"/>
@@ -38628,7 +38628,7 @@
         <w:pStyle w:val="Heading2"/>
       </w:pPr>
       <w:bookmarkStart w:id="67" w:name="Xb17945b5d9374e5087c2c96ace1685ff00e2e22"/>
-      <w:bookmarkStart w:id="68" w:name="_Toc239348941"/>
+      <w:bookmarkStart w:id="68" w:name="_Toc239403585"/>
       <w:bookmarkEnd w:id="57"/>
       <w:bookmarkEnd w:id="66"/>
       <w:r>
@@ -39998,7 +39998,7 @@
         <w:pStyle w:val="Heading2"/>
       </w:pPr>
       <w:bookmarkStart w:id="69" w:name="Xfad7df3f963ac0b8ebfe8cf87d7c64fa075f760"/>
-      <w:bookmarkStart w:id="70" w:name="_Toc239348942"/>
+      <w:bookmarkStart w:id="70" w:name="_Toc239403586"/>
       <w:bookmarkEnd w:id="67"/>
       <w:r>
         <w:t>3.6. B</w:t>
@@ -40044,7 +40044,7 @@
           <w:noProof/>
         </w:rPr>
         <w:drawing>
-          <wp:inline distT="0" distB="0" distL="0" distR="0" wp14:anchorId="669090F8" wp14:editId="531654D5">
+          <wp:inline distT="0" distB="0" distL="0" distR="0" wp14:anchorId="310B4E1C" wp14:editId="19C055BA">
             <wp:extent cx="5334000" cy="1217839"/>
             <wp:effectExtent l="0" t="0" r="0" b="0"/>
             <wp:docPr id="81" name="Picture"/>
@@ -42825,7 +42825,7 @@
         <w:pStyle w:val="Heading2"/>
       </w:pPr>
       <w:bookmarkStart w:id="72" w:name="X9b5467225f237e4ee44d60f7d236cbdfdaa1e07"/>
-      <w:bookmarkStart w:id="73" w:name="_Toc239348943"/>
+      <w:bookmarkStart w:id="73" w:name="_Toc239403587"/>
       <w:bookmarkEnd w:id="69"/>
       <w:r>
         <w:t xml:space="preserve">3.7. </w:t>
@@ -42945,7 +42945,7 @@
           <w:noProof/>
         </w:rPr>
         <w:drawing>
-          <wp:inline distT="0" distB="0" distL="0" distR="0" wp14:anchorId="1AC147F2" wp14:editId="03F1DD38">
+          <wp:inline distT="0" distB="0" distL="0" distR="0" wp14:anchorId="02A573FA" wp14:editId="205EE22A">
             <wp:extent cx="5334000" cy="5953125"/>
             <wp:effectExtent l="0" t="0" r="0" b="0"/>
             <wp:docPr id="86" name="Picture"/>
@@ -44133,7 +44133,7 @@
         <w:pStyle w:val="Heading1"/>
       </w:pPr>
       <w:bookmarkStart w:id="75" w:name="chương-4-thực-nghiệm-và-đánh-giá"/>
-      <w:bookmarkStart w:id="76" w:name="_Toc239348944"/>
+      <w:bookmarkStart w:id="76" w:name="_Toc239403588"/>
       <w:bookmarkEnd w:id="42"/>
       <w:bookmarkEnd w:id="72"/>
       <w:r>
@@ -44158,7 +44158,7 @@
         <w:pStyle w:val="Heading2"/>
       </w:pPr>
       <w:bookmarkStart w:id="77" w:name="X43cb4672f728ce1df4f211c1d18360135f0c40b"/>
-      <w:bookmarkStart w:id="78" w:name="_Toc239348945"/>
+      <w:bookmarkStart w:id="78" w:name="_Toc239403589"/>
       <w:r>
         <w:t>4.1. Môi trư</w:t>
       </w:r>
@@ -45780,7 +45780,7 @@
         <w:pStyle w:val="Heading2"/>
       </w:pPr>
       <w:bookmarkStart w:id="79" w:name="Xe48430b60e6d2b1022368eb4316c1fe9f53411f"/>
-      <w:bookmarkStart w:id="80" w:name="_Toc239348946"/>
+      <w:bookmarkStart w:id="80" w:name="_Toc239403590"/>
       <w:bookmarkEnd w:id="77"/>
       <w:r>
         <w:t>4.2. K</w:t>
@@ -47594,7 +47594,19 @@
         <w:pStyle w:val="BodyText"/>
       </w:pPr>
       <w:r>
-        <w:t>Chênh l</w:t>
+        <w:t>B</w:t>
+      </w:r>
+      <w:r>
+        <w:t>ả</w:t>
+      </w:r>
+      <w:r>
+        <w:t>ng 4.2 cho th</w:t>
+      </w:r>
+      <w:r>
+        <w:t>ấ</w:t>
+      </w:r>
+      <w:r>
+        <w:t>y chênh l</w:t>
       </w:r>
       <w:r>
         <w:t>ệ</w:t>
@@ -49351,7 +49363,7 @@
         <w:pStyle w:val="Heading2"/>
       </w:pPr>
       <w:bookmarkStart w:id="87" w:name="X09b724f0b907c7f652c2569c27ef1d5728c277c"/>
-      <w:bookmarkStart w:id="88" w:name="_Toc239348947"/>
+      <w:bookmarkStart w:id="88" w:name="_Toc239403591"/>
       <w:bookmarkEnd w:id="79"/>
       <w:bookmarkEnd w:id="85"/>
       <w:r>
@@ -51629,7 +51641,7 @@
           <w:noProof/>
         </w:rPr>
         <w:drawing>
-          <wp:inline distT="0" distB="0" distL="0" distR="0" wp14:anchorId="70C059B3" wp14:editId="1E3E1640">
+          <wp:inline distT="0" distB="0" distL="0" distR="0" wp14:anchorId="73171C68" wp14:editId="58A9A6A2">
             <wp:extent cx="5334000" cy="2883855"/>
             <wp:effectExtent l="0" t="0" r="0" b="0"/>
             <wp:docPr id="103" name="Picture"/>
@@ -56905,7 +56917,7 @@
         <w:pStyle w:val="Heading2"/>
       </w:pPr>
       <w:bookmarkStart w:id="98" w:name="X0c205a3fd5474e5e1d380a3735df7543f97f059"/>
-      <w:bookmarkStart w:id="99" w:name="_Toc239348948"/>
+      <w:bookmarkStart w:id="99" w:name="_Toc239403592"/>
       <w:bookmarkEnd w:id="87"/>
       <w:bookmarkEnd w:id="96"/>
       <w:r>
@@ -60188,7 +60200,7 @@
         <w:pStyle w:val="Heading2"/>
       </w:pPr>
       <w:bookmarkStart w:id="105" w:name="X8f4b2c0e55e8764a0677cdfa39e96dbe6822859"/>
-      <w:bookmarkStart w:id="106" w:name="_Toc239348949"/>
+      <w:bookmarkStart w:id="106" w:name="_Toc239403593"/>
       <w:bookmarkEnd w:id="98"/>
       <w:bookmarkEnd w:id="104"/>
       <w:r>
@@ -63385,7 +63397,7 @@
         <w:pStyle w:val="Heading2"/>
       </w:pPr>
       <w:bookmarkStart w:id="112" w:name="X7468ed9f095dd0192ebc5de940dc44b5cd3e099"/>
-      <w:bookmarkStart w:id="113" w:name="_Toc239348950"/>
+      <w:bookmarkStart w:id="113" w:name="_Toc239403594"/>
       <w:bookmarkEnd w:id="105"/>
       <w:bookmarkEnd w:id="110"/>
       <w:r>
@@ -64570,7 +64582,7 @@
         <w:t>ả</w:t>
       </w:r>
       <w:r>
-        <w:t>ng này khép l</w:t>
+        <w:t>ng 4.12 khép l</w:t>
       </w:r>
       <w:r>
         <w:t>ạ</w:t>
@@ -65243,7 +65255,7 @@
           <w:noProof/>
         </w:rPr>
         <w:drawing>
-          <wp:inline distT="0" distB="0" distL="0" distR="0" wp14:anchorId="4EE85038" wp14:editId="415A4C4F">
+          <wp:inline distT="0" distB="0" distL="0" distR="0" wp14:anchorId="7F6A8192" wp14:editId="33F9AD62">
             <wp:extent cx="5334000" cy="3317670"/>
             <wp:effectExtent l="0" t="0" r="0" b="0"/>
             <wp:docPr id="126" name="Picture"/>
@@ -65355,7 +65367,43 @@
         <w:pStyle w:val="BodyText"/>
       </w:pPr>
       <w:r>
-        <w:t>Hàng trên là hai cơ ch</w:t>
+        <w:t>Hình 4.2 đ</w:t>
+      </w:r>
+      <w:r>
+        <w:t>ặ</w:t>
+      </w:r>
+      <w:r>
+        <w:t>t các con s</w:t>
+      </w:r>
+      <w:r>
+        <w:t>ố</w:t>
+      </w:r>
+      <w:r>
+        <w:t xml:space="preserve"> c</w:t>
+      </w:r>
+      <w:r>
+        <w:t>ủ</w:t>
+      </w:r>
+      <w:r>
+        <w:t>a B</w:t>
+      </w:r>
+      <w:r>
+        <w:t>ả</w:t>
+      </w:r>
+      <w:r>
+        <w:t xml:space="preserve">ng 4.12 lên </w:t>
+      </w:r>
+      <w:r>
+        <w:t>ả</w:t>
+      </w:r>
+      <w:r>
+        <w:t>nh th</w:t>
+      </w:r>
+      <w:r>
+        <w:t>ậ</w:t>
+      </w:r>
+      <w:r>
+        <w:t>t. Hàng trên là hai cơ ch</w:t>
       </w:r>
       <w:r>
         <w:t>ế</w:t>
@@ -65367,19 +65415,7 @@
         <w:t>ử</w:t>
       </w:r>
       <w:r>
-        <w:t xml:space="preserve">a trên </w:t>
-      </w:r>
-      <w:r>
-        <w:t>ả</w:t>
-      </w:r>
-      <w:r>
-        <w:t>nh th</w:t>
-      </w:r>
-      <w:r>
-        <w:t>ậ</w:t>
-      </w:r>
-      <w:r>
-        <w:t>t: m</w:t>
+        <w:t>a: m</w:t>
       </w:r>
       <w:r>
         <w:t>ặ</w:t>
@@ -65987,7 +66023,7 @@
         <w:pStyle w:val="Heading2"/>
       </w:pPr>
       <w:bookmarkStart w:id="116" w:name="X88e1c26a6581f7bd1dbdb2c85ae6116c5ba8393"/>
-      <w:bookmarkStart w:id="117" w:name="_Toc239348951"/>
+      <w:bookmarkStart w:id="117" w:name="_Toc239403595"/>
       <w:bookmarkEnd w:id="112"/>
       <w:r>
         <w:t>4.7. Các y</w:t>
@@ -66854,10 +66890,7 @@
               <w:t>Không có.</w:t>
             </w:r>
             <w:r>
-              <w:t xml:space="preserve"> </w:t>
-            </w:r>
-            <w:r>
-              <w:t>Cách đúng là gi</w:t>
+              <w:t xml:space="preserve"> Cách đúng là gi</w:t>
             </w:r>
             <w:r>
               <w:t>ữ</w:t>
@@ -67842,7 +67875,7 @@
         <w:pStyle w:val="Heading1"/>
       </w:pPr>
       <w:bookmarkStart w:id="119" w:name="chương-5-kết-luận-và-hướng-phát-triển"/>
-      <w:bookmarkStart w:id="120" w:name="_Toc239348952"/>
+      <w:bookmarkStart w:id="120" w:name="_Toc239403596"/>
       <w:bookmarkEnd w:id="75"/>
       <w:bookmarkEnd w:id="116"/>
       <w:r>
@@ -67879,7 +67912,7 @@
         <w:pStyle w:val="Heading2"/>
       </w:pPr>
       <w:bookmarkStart w:id="121" w:name="Xcefa088882d41b38c21b7b5b44c738cb5564fbb"/>
-      <w:bookmarkStart w:id="122" w:name="_Toc239348953"/>
+      <w:bookmarkStart w:id="122" w:name="_Toc239403597"/>
       <w:r>
         <w:t>5.1. K</w:t>
       </w:r>
@@ -68195,10 +68228,7 @@
       <w:bookmarkStart w:id="123" w:name="tbl-5-1"/>
       <w:bookmarkEnd w:id="123"/>
       <w:r>
-        <w:t xml:space="preserve"> </w:t>
-      </w:r>
-      <w:r>
-        <w:t>Đ</w:t>
+        <w:t xml:space="preserve"> Đ</w:t>
       </w:r>
       <w:r>
         <w:t>ố</w:t>
@@ -69225,10 +69255,7 @@
         <w:t>m</w:t>
       </w:r>
       <w:r>
-        <w:t xml:space="preserve"> </w:t>
-      </w:r>
-      <w:r>
-        <w:t>cho PaddleOCR — đi</w:t>
+        <w:t xml:space="preserve"> cho PaddleOCR — đi</w:t>
       </w:r>
       <w:r>
         <w:t>ề</w:t>
@@ -69380,7 +69407,7 @@
         <w:pStyle w:val="Heading2"/>
       </w:pPr>
       <w:bookmarkStart w:id="124" w:name="Xe79f58ab8ce7b6f148c68a374118dd9eaec1a1c"/>
-      <w:bookmarkStart w:id="125" w:name="_Toc239348954"/>
+      <w:bookmarkStart w:id="125" w:name="_Toc239403598"/>
       <w:bookmarkEnd w:id="121"/>
       <w:r>
         <w:t>5.2. H</w:t>
@@ -69399,6 +69426,62 @@
     <w:p>
       <w:pPr>
         <w:pStyle w:val="FirstParagraph"/>
+      </w:pPr>
+      <w:r>
+        <w:t>B</w:t>
+      </w:r>
+      <w:r>
+        <w:t>ả</w:t>
+      </w:r>
+      <w:r>
+        <w:t>ng 5.2 t</w:t>
+      </w:r>
+      <w:r>
+        <w:t>ổ</w:t>
+      </w:r>
+      <w:r>
+        <w:t>ng h</w:t>
+      </w:r>
+      <w:r>
+        <w:t>ợ</w:t>
+      </w:r>
+      <w:r>
+        <w:t>p năm h</w:t>
+      </w:r>
+      <w:r>
+        <w:t>ạ</w:t>
+      </w:r>
+      <w:r>
+        <w:t>n ch</w:t>
+      </w:r>
+      <w:r>
+        <w:t>ế</w:t>
+      </w:r>
+      <w:r>
+        <w:t>, x</w:t>
+      </w:r>
+      <w:r>
+        <w:t>ế</w:t>
+      </w:r>
+      <w:r>
+        <w:t>p theo m</w:t>
+      </w:r>
+      <w:r>
+        <w:t>ứ</w:t>
+      </w:r>
+      <w:r>
+        <w:t>c nghiêm tr</w:t>
+      </w:r>
+      <w:r>
+        <w:t>ọ</w:t>
+      </w:r>
+      <w:r>
+        <w:t>ng.</w:t>
+      </w:r>
+    </w:p>
+    <w:p>
+      <w:pPr>
+        <w:pStyle w:val="BodyText"/>
       </w:pPr>
       <w:r>
         <w:rPr>
@@ -70594,7 +70677,7 @@
         <w:pStyle w:val="Heading2"/>
       </w:pPr>
       <w:bookmarkStart w:id="127" w:name="X66db71c9020c40cf46e490c5c37ad244e2b7594"/>
-      <w:bookmarkStart w:id="128" w:name="_Toc239348955"/>
+      <w:bookmarkStart w:id="128" w:name="_Toc239403599"/>
       <w:bookmarkEnd w:id="124"/>
       <w:r>
         <w:t>5.3. Hư</w:t>
@@ -72229,7 +72312,7 @@
         <w:pStyle w:val="Heading2"/>
       </w:pPr>
       <w:bookmarkStart w:id="130" w:name="Xe5a2fe3dfcd4681648271b7ddc344b106e48b3b"/>
-      <w:bookmarkStart w:id="131" w:name="_Toc239348956"/>
+      <w:bookmarkStart w:id="131" w:name="_Toc239403600"/>
       <w:bookmarkEnd w:id="127"/>
       <w:r>
         <w:t>5.4. K</w:t>
@@ -73155,7 +73238,7 @@
         <w:pStyle w:val="Heading1"/>
       </w:pPr>
       <w:bookmarkStart w:id="132" w:name="tài-liệu-tham-khảo"/>
-      <w:bookmarkStart w:id="133" w:name="_Toc239348957"/>
+      <w:bookmarkStart w:id="133" w:name="_Toc239403601"/>
       <w:bookmarkEnd w:id="119"/>
       <w:bookmarkEnd w:id="130"/>
       <w:r>
@@ -74114,7 +74197,7 @@
         <w:pStyle w:val="Heading1"/>
       </w:pPr>
       <w:bookmarkStart w:id="134" w:name="phụ-lục"/>
-      <w:bookmarkStart w:id="135" w:name="_Toc239348958"/>
+      <w:bookmarkStart w:id="135" w:name="_Toc239403602"/>
       <w:bookmarkEnd w:id="132"/>
       <w:r>
         <w:t>PH</w:t>
@@ -74138,7 +74221,7 @@
         <w:pStyle w:val="Heading2"/>
       </w:pPr>
       <w:bookmarkStart w:id="136" w:name="phụ-lục-a-cấu-hình-và-siêu-tham-số"/>
-      <w:bookmarkStart w:id="137" w:name="_Toc239348959"/>
+      <w:bookmarkStart w:id="137" w:name="_Toc239403603"/>
       <w:r>
         <w:t>Ph</w:t>
       </w:r>
@@ -76358,7 +76441,7 @@
         <w:pStyle w:val="Heading2"/>
       </w:pPr>
       <w:bookmarkStart w:id="141" w:name="phụ-lục-b-hướng-dẫn-cài-đặt-và-chạy"/>
-      <w:bookmarkStart w:id="142" w:name="_Toc239348960"/>
+      <w:bookmarkStart w:id="142" w:name="_Toc239403604"/>
       <w:bookmarkEnd w:id="136"/>
       <w:bookmarkEnd w:id="140"/>
       <w:r>
@@ -78026,7 +78109,7 @@
         <w:pStyle w:val="Heading2"/>
       </w:pPr>
       <w:bookmarkStart w:id="147" w:name="phụ-lục-c-phân-công-công-việc"/>
-      <w:bookmarkStart w:id="148" w:name="_Toc239348961"/>
+      <w:bookmarkStart w:id="148" w:name="_Toc239403605"/>
       <w:bookmarkEnd w:id="141"/>
       <w:bookmarkEnd w:id="146"/>
       <w:r>
@@ -78805,7 +78888,7 @@
   <w:abstractNum w:abstractNumId="0" w15:restartNumberingAfterBreak="0">
     <w:nsid w:val="0000A990"/>
     <w:multiLevelType w:val="multilevel"/>
-    <w:tmpl w:val="FE605CDA"/>
+    <w:tmpl w:val="F1D88700"/>
     <w:lvl w:ilvl="0">
       <w:numFmt w:val="bullet"/>
       <w:lvlText w:val=" "/>
@@ -78882,7 +78965,7 @@
   <w:abstractNum w:abstractNumId="1" w15:restartNumberingAfterBreak="0">
     <w:nsid w:val="0000A991"/>
     <w:multiLevelType w:val="multilevel"/>
-    <w:tmpl w:val="5CAA45E0"/>
+    <w:tmpl w:val="D884D204"/>
     <w:lvl w:ilvl="0">
       <w:numFmt w:val="bullet"/>
       <w:lvlText w:val=""/>
@@ -78986,7 +79069,7 @@
   <w:abstractNum w:abstractNumId="2" w15:restartNumberingAfterBreak="0">
     <w:nsid w:val="00A99411"/>
     <w:multiLevelType w:val="multilevel"/>
-    <w:tmpl w:val="B4B2825C"/>
+    <w:tmpl w:val="01C42E46"/>
     <w:lvl w:ilvl="0">
       <w:start w:val="1"/>
       <w:numFmt w:val="decimal"/>
@@ -79069,10 +79152,10 @@
       </w:pPr>
     </w:lvl>
   </w:abstractNum>
-  <w:num w:numId="1" w16cid:durableId="1309433972">
+  <w:num w:numId="1" w16cid:durableId="437221026">
     <w:abstractNumId w:val="0"/>
   </w:num>
-  <w:num w:numId="2" w16cid:durableId="1312711192">
+  <w:num w:numId="2" w16cid:durableId="1328900498">
     <w:abstractNumId w:val="2"/>
     <w:lvlOverride w:ilvl="0">
       <w:startOverride w:val="1"/>
@@ -79102,22 +79185,22 @@
       <w:startOverride w:val="1"/>
     </w:lvlOverride>
   </w:num>
-  <w:num w:numId="3" w16cid:durableId="113260261">
+  <w:num w:numId="3" w16cid:durableId="1608151889">
     <w:abstractNumId w:val="1"/>
   </w:num>
-  <w:num w:numId="4" w16cid:durableId="610627118">
+  <w:num w:numId="4" w16cid:durableId="2033069136">
     <w:abstractNumId w:val="1"/>
   </w:num>
-  <w:num w:numId="5" w16cid:durableId="667094138">
+  <w:num w:numId="5" w16cid:durableId="1566211767">
     <w:abstractNumId w:val="1"/>
   </w:num>
-  <w:num w:numId="6" w16cid:durableId="635835016">
+  <w:num w:numId="6" w16cid:durableId="1386219733">
     <w:abstractNumId w:val="1"/>
   </w:num>
-  <w:num w:numId="7" w16cid:durableId="1666350730">
+  <w:num w:numId="7" w16cid:durableId="950697867">
     <w:abstractNumId w:val="1"/>
   </w:num>
-  <w:num w:numId="8" w16cid:durableId="52588326">
+  <w:num w:numId="8" w16cid:durableId="892548732">
     <w:abstractNumId w:val="2"/>
     <w:lvlOverride w:ilvl="0">
       <w:startOverride w:val="1"/>
@@ -79147,7 +79230,7 @@
       <w:startOverride w:val="1"/>
     </w:lvlOverride>
   </w:num>
-  <w:num w:numId="9" w16cid:durableId="37046029">
+  <w:num w:numId="9" w16cid:durableId="1263300929">
     <w:abstractNumId w:val="1"/>
   </w:num>
 </w:numbering>
@@ -80384,7 +80467,7 @@
     <w:next w:val="Normal"/>
     <w:autoRedefine/>
     <w:uiPriority w:val="39"/>
-    <w:rsid w:val="00925A76"/>
+    <w:rsid w:val="00D370BD"/>
     <w:pPr>
       <w:spacing w:after="100"/>
     </w:pPr>
@@ -80395,7 +80478,7 @@
     <w:next w:val="Normal"/>
     <w:autoRedefine/>
     <w:uiPriority w:val="39"/>
-    <w:rsid w:val="00925A76"/>
+    <w:rsid w:val="00D370BD"/>
     <w:pPr>
       <w:spacing w:after="100"/>
       <w:ind w:left="240"/>

</xml_diff>